<commit_message>
update 2 Linux assignment to the github.com
</commit_message>
<xml_diff>
--- a/25-26-2Linux系统管理与Shell编程/Lab0_2351610105.docx
+++ b/25-26-2Linux系统管理与Shell编程/Lab0_2351610105.docx
@@ -20,11 +20,6 @@
       </w:r>
     </w:p>
     <w:p>
-      <w:pPr>
-        <w:rPr>
-          <w:rFonts w:hint="eastAsia"/>
-        </w:rPr>
-      </w:pPr>
       <w:r>
         <w:rPr>
           <w:rFonts w:hint="eastAsia"/>
@@ -166,14 +161,13 @@
     <w:p>
       <w:r>
         <w:rPr>
-          <w:rFonts w:hint="eastAsia"/>
           <w:noProof/>
         </w:rPr>
         <w:drawing>
           <wp:inline distT="0" distB="0" distL="0" distR="0">
-            <wp:extent cx="5274310" cy="1693545"/>
+            <wp:extent cx="5274310" cy="2720340"/>
             <wp:effectExtent l="0" t="0" r="0" b="0"/>
-            <wp:docPr id="669517930" name="图片 3"/>
+            <wp:docPr id="1791482166" name="图片 5"/>
             <wp:cNvGraphicFramePr>
               <a:graphicFrameLocks xmlns:a="http://schemas.openxmlformats.org/drawingml/2006/main" noChangeAspect="1"/>
             </wp:cNvGraphicFramePr>
@@ -181,7 +175,7 @@
               <a:graphicData uri="http://schemas.openxmlformats.org/drawingml/2006/picture">
                 <pic:pic xmlns:pic="http://schemas.openxmlformats.org/drawingml/2006/picture">
                   <pic:nvPicPr>
-                    <pic:cNvPr id="669517930" name="图片 669517930"/>
+                    <pic:cNvPr id="1791482166" name="图片 1791482166"/>
                     <pic:cNvPicPr/>
                   </pic:nvPicPr>
                   <pic:blipFill>
@@ -199,7 +193,7 @@
                   <pic:spPr>
                     <a:xfrm>
                       <a:off x="0" y="0"/>
-                      <a:ext cx="5274310" cy="1693545"/>
+                      <a:ext cx="5274310" cy="2720340"/>
                     </a:xfrm>
                     <a:prstGeom prst="rect">
                       <a:avLst/>
@@ -293,9 +287,9 @@
         <w:lastRenderedPageBreak/>
         <w:drawing>
           <wp:inline distT="0" distB="0" distL="0" distR="0">
-            <wp:extent cx="5274310" cy="1316355"/>
-            <wp:effectExtent l="0" t="0" r="0" b="4445"/>
-            <wp:docPr id="27012027" name="图片 5"/>
+            <wp:extent cx="5274310" cy="1182370"/>
+            <wp:effectExtent l="0" t="0" r="0" b="0"/>
+            <wp:docPr id="711581410" name="图片 3"/>
             <wp:cNvGraphicFramePr>
               <a:graphicFrameLocks xmlns:a="http://schemas.openxmlformats.org/drawingml/2006/main" noChangeAspect="1"/>
             </wp:cNvGraphicFramePr>
@@ -303,7 +297,7 @@
               <a:graphicData uri="http://schemas.openxmlformats.org/drawingml/2006/picture">
                 <pic:pic xmlns:pic="http://schemas.openxmlformats.org/drawingml/2006/picture">
                   <pic:nvPicPr>
-                    <pic:cNvPr id="27012027" name="图片 27012027"/>
+                    <pic:cNvPr id="711581410" name="图片 711581410"/>
                     <pic:cNvPicPr/>
                   </pic:nvPicPr>
                   <pic:blipFill>
@@ -321,7 +315,7 @@
                   <pic:spPr>
                     <a:xfrm>
                       <a:off x="0" y="0"/>
-                      <a:ext cx="5274310" cy="1316355"/>
+                      <a:ext cx="5274310" cy="1182370"/>
                     </a:xfrm>
                     <a:prstGeom prst="rect">
                       <a:avLst/>
@@ -457,13 +451,128 @@
         </w:drawing>
       </w:r>
     </w:p>
-    <w:p/>
-    <w:p>
-      <w:pPr>
+    <w:p>
+      <w:r>
         <w:rPr>
           <w:rFonts w:hint="eastAsia"/>
         </w:rPr>
-      </w:pPr>
+        <w:t>8</w:t>
+      </w:r>
+      <w:r>
+        <w:t>.Create a file named “lab0_5.sh” to show the modification of permissions.</w:t>
+      </w:r>
+    </w:p>
+    <w:p>
+      <w:r>
+        <w:rPr>
+          <w:noProof/>
+        </w:rPr>
+        <w:drawing>
+          <wp:inline distT="0" distB="0" distL="0" distR="0">
+            <wp:extent cx="5274310" cy="973455"/>
+            <wp:effectExtent l="0" t="0" r="0" b="4445"/>
+            <wp:docPr id="192792161" name="图片 1"/>
+            <wp:cNvGraphicFramePr>
+              <a:graphicFrameLocks xmlns:a="http://schemas.openxmlformats.org/drawingml/2006/main" noChangeAspect="1"/>
+            </wp:cNvGraphicFramePr>
+            <a:graphic xmlns:a="http://schemas.openxmlformats.org/drawingml/2006/main">
+              <a:graphicData uri="http://schemas.openxmlformats.org/drawingml/2006/picture">
+                <pic:pic xmlns:pic="http://schemas.openxmlformats.org/drawingml/2006/picture">
+                  <pic:nvPicPr>
+                    <pic:cNvPr id="192792161" name="图片 192792161"/>
+                    <pic:cNvPicPr/>
+                  </pic:nvPicPr>
+                  <pic:blipFill>
+                    <a:blip r:embed="rId11">
+                      <a:extLst>
+                        <a:ext uri="{28A0092B-C50C-407E-A947-70E740481C1C}">
+                          <a14:useLocalDpi xmlns:a14="http://schemas.microsoft.com/office/drawing/2010/main" val="0"/>
+                        </a:ext>
+                      </a:extLst>
+                    </a:blip>
+                    <a:stretch>
+                      <a:fillRect/>
+                    </a:stretch>
+                  </pic:blipFill>
+                  <pic:spPr>
+                    <a:xfrm>
+                      <a:off x="0" y="0"/>
+                      <a:ext cx="5274310" cy="973455"/>
+                    </a:xfrm>
+                    <a:prstGeom prst="rect">
+                      <a:avLst/>
+                    </a:prstGeom>
+                  </pic:spPr>
+                </pic:pic>
+              </a:graphicData>
+            </a:graphic>
+          </wp:inline>
+        </w:drawing>
+      </w:r>
+    </w:p>
+    <w:p>
+      <w:pPr>
+        <w:rPr>
+          <w:rFonts w:hint="eastAsia"/>
+        </w:rPr>
+      </w:pPr>
+      <w:r>
+        <w:rPr>
+          <w:rFonts w:hint="eastAsia"/>
+          <w:noProof/>
+        </w:rPr>
+        <w:lastRenderedPageBreak/>
+        <w:drawing>
+          <wp:inline distT="0" distB="0" distL="0" distR="0">
+            <wp:extent cx="5274310" cy="3400425"/>
+            <wp:effectExtent l="0" t="0" r="0" b="3175"/>
+            <wp:docPr id="1456355172" name="图片 2"/>
+            <wp:cNvGraphicFramePr>
+              <a:graphicFrameLocks xmlns:a="http://schemas.openxmlformats.org/drawingml/2006/main" noChangeAspect="1"/>
+            </wp:cNvGraphicFramePr>
+            <a:graphic xmlns:a="http://schemas.openxmlformats.org/drawingml/2006/main">
+              <a:graphicData uri="http://schemas.openxmlformats.org/drawingml/2006/picture">
+                <pic:pic xmlns:pic="http://schemas.openxmlformats.org/drawingml/2006/picture">
+                  <pic:nvPicPr>
+                    <pic:cNvPr id="1456355172" name="图片 1456355172"/>
+                    <pic:cNvPicPr/>
+                  </pic:nvPicPr>
+                  <pic:blipFill>
+                    <a:blip r:embed="rId12">
+                      <a:extLst>
+                        <a:ext uri="{28A0092B-C50C-407E-A947-70E740481C1C}">
+                          <a14:useLocalDpi xmlns:a14="http://schemas.microsoft.com/office/drawing/2010/main" val="0"/>
+                        </a:ext>
+                      </a:extLst>
+                    </a:blip>
+                    <a:stretch>
+                      <a:fillRect/>
+                    </a:stretch>
+                  </pic:blipFill>
+                  <pic:spPr>
+                    <a:xfrm>
+                      <a:off x="0" y="0"/>
+                      <a:ext cx="5274310" cy="3400425"/>
+                    </a:xfrm>
+                    <a:prstGeom prst="rect">
+                      <a:avLst/>
+                    </a:prstGeom>
+                  </pic:spPr>
+                </pic:pic>
+              </a:graphicData>
+            </a:graphic>
+          </wp:inline>
+        </w:drawing>
+      </w:r>
+    </w:p>
+    <w:p>
+      <w:pPr>
+        <w:rPr>
+          <w:rFonts w:hint="eastAsia"/>
+        </w:rPr>
+      </w:pPr>
+    </w:p>
+    <w:p>
       <w:r>
         <w:rPr>
           <w:rFonts w:hint="eastAsia"/>
@@ -1843,7 +1952,6 @@
           <w:kern w:val="0"/>
           <w:szCs w:val="22"/>
         </w:rPr>
-        <w:lastRenderedPageBreak/>
         <w:t>2351610105@</w:t>
       </w:r>
       <w:proofErr w:type="gramStart"/>
@@ -2026,7 +2134,17 @@
           <w:kern w:val="0"/>
           <w:szCs w:val="22"/>
         </w:rPr>
-        <w:t xml:space="preserve"> echo 'echo "Hello World"' &gt; lab0_1.sh</w:t>
+        <w:t xml:space="preserve"> echo 'echo "Hello </w:t>
+      </w:r>
+      <w:r>
+        <w:rPr>
+          <w:rFonts w:ascii="Menlo" w:hAnsi="Menlo" w:cs="Menlo"/>
+          <w:color w:val="000000"/>
+          <w:kern w:val="0"/>
+          <w:szCs w:val="22"/>
+        </w:rPr>
+        <w:lastRenderedPageBreak/>
+        <w:t>World"' &gt; lab0_1.sh</w:t>
       </w:r>
     </w:p>
     <w:p>
@@ -2247,7 +2365,27 @@
           <w:kern w:val="0"/>
           <w:szCs w:val="22"/>
         </w:rPr>
-        <w:t xml:space="preserve"> echo 'echo \"current path:\"' &gt;lab0_2.sh</w:t>
+        <w:t xml:space="preserve"> echo '</w:t>
+      </w:r>
+      <w:proofErr w:type="spellStart"/>
+      <w:r>
+        <w:rPr>
+          <w:rFonts w:ascii="Menlo" w:hAnsi="Menlo" w:cs="Menlo"/>
+          <w:color w:val="000000"/>
+          <w:kern w:val="0"/>
+          <w:szCs w:val="22"/>
+        </w:rPr>
+        <w:t>pwd</w:t>
+      </w:r>
+      <w:proofErr w:type="spellEnd"/>
+      <w:r>
+        <w:rPr>
+          <w:rFonts w:ascii="Menlo" w:hAnsi="Menlo" w:cs="Menlo"/>
+          <w:color w:val="000000"/>
+          <w:kern w:val="0"/>
+          <w:szCs w:val="22"/>
+        </w:rPr>
+        <w:t>' &gt; lab0_2.sh</w:t>
       </w:r>
     </w:p>
     <w:p>
@@ -2339,27 +2477,7 @@
           <w:kern w:val="0"/>
           <w:szCs w:val="22"/>
         </w:rPr>
-        <w:t xml:space="preserve"> echo '</w:t>
-      </w:r>
-      <w:proofErr w:type="spellStart"/>
-      <w:r>
-        <w:rPr>
-          <w:rFonts w:ascii="Menlo" w:hAnsi="Menlo" w:cs="Menlo"/>
-          <w:color w:val="000000"/>
-          <w:kern w:val="0"/>
-          <w:szCs w:val="22"/>
-        </w:rPr>
-        <w:t>pwd</w:t>
-      </w:r>
-      <w:proofErr w:type="spellEnd"/>
-      <w:r>
-        <w:rPr>
-          <w:rFonts w:ascii="Menlo" w:hAnsi="Menlo" w:cs="Menlo"/>
-          <w:color w:val="000000"/>
-          <w:kern w:val="0"/>
-          <w:szCs w:val="22"/>
-        </w:rPr>
-        <w:t>' &gt;&gt; lab0_2.sh</w:t>
+        <w:t xml:space="preserve"> echo 'ls -la' &gt;&gt; lab0_2.sh</w:t>
       </w:r>
     </w:p>
     <w:p>
@@ -2451,7 +2569,7 @@
           <w:kern w:val="0"/>
           <w:szCs w:val="22"/>
         </w:rPr>
-        <w:t xml:space="preserve"> echo 'echo \"file list:\"' &gt;&gt;lab0_2.sh</w:t>
+        <w:t xml:space="preserve"> bash ./lab0_2.sh</w:t>
       </w:r>
     </w:p>
     <w:p>
@@ -2484,66 +2602,11 @@
       <w:r>
         <w:rPr>
           <w:rFonts w:ascii="Menlo" w:hAnsi="Menlo" w:cs="Menlo"/>
-          <w:b/>
-          <w:bCs/>
-          <w:color w:val="2FB41D"/>
-          <w:kern w:val="0"/>
-          <w:szCs w:val="22"/>
-        </w:rPr>
-        <w:t>2351610105@</w:t>
-      </w:r>
-      <w:proofErr w:type="gramStart"/>
-      <w:r>
-        <w:rPr>
-          <w:rFonts w:ascii="Menlo" w:hAnsi="Menlo" w:cs="Menlo"/>
-          <w:b/>
-          <w:bCs/>
-          <w:color w:val="2FB41D"/>
-          <w:kern w:val="0"/>
-          <w:szCs w:val="22"/>
-        </w:rPr>
-        <w:t>raspberrypi</w:t>
-      </w:r>
-      <w:r>
-        <w:rPr>
-          <w:rFonts w:ascii="Menlo" w:hAnsi="Menlo" w:cs="Menlo"/>
-          <w:color w:val="000000"/>
-          <w:kern w:val="0"/>
-          <w:szCs w:val="22"/>
-        </w:rPr>
-        <w:t>:</w:t>
-      </w:r>
-      <w:r>
-        <w:rPr>
-          <w:rFonts w:ascii="Menlo" w:hAnsi="Menlo" w:cs="Menlo"/>
-          <w:b/>
-          <w:bCs/>
-          <w:color w:val="400BD9"/>
-          <w:kern w:val="0"/>
-          <w:szCs w:val="22"/>
-        </w:rPr>
-        <w:t>~</w:t>
-      </w:r>
-      <w:proofErr w:type="gramEnd"/>
-      <w:r>
-        <w:rPr>
-          <w:rFonts w:ascii="Menlo" w:hAnsi="Menlo" w:cs="Menlo"/>
-          <w:b/>
-          <w:bCs/>
-          <w:color w:val="400BD9"/>
-          <w:kern w:val="0"/>
-          <w:szCs w:val="22"/>
-        </w:rPr>
-        <w:t>/labs/lab0 $</w:t>
-      </w:r>
-      <w:r>
-        <w:rPr>
-          <w:rFonts w:ascii="Menlo" w:hAnsi="Menlo" w:cs="Menlo"/>
-          <w:color w:val="000000"/>
-          <w:kern w:val="0"/>
-          <w:szCs w:val="22"/>
-        </w:rPr>
-        <w:t xml:space="preserve"> echo 'ls -la' &gt;&gt; lab0_2.sh</w:t>
+          <w:color w:val="000000"/>
+          <w:kern w:val="0"/>
+          <w:szCs w:val="22"/>
+        </w:rPr>
+        <w:t>/home/2351610105/labs/lab0</w:t>
       </w:r>
     </w:p>
     <w:p>
@@ -2576,66 +2639,11 @@
       <w:r>
         <w:rPr>
           <w:rFonts w:ascii="Menlo" w:hAnsi="Menlo" w:cs="Menlo"/>
-          <w:b/>
-          <w:bCs/>
-          <w:color w:val="2FB41D"/>
-          <w:kern w:val="0"/>
-          <w:szCs w:val="22"/>
-        </w:rPr>
-        <w:t>2351610105@</w:t>
-      </w:r>
-      <w:proofErr w:type="gramStart"/>
-      <w:r>
-        <w:rPr>
-          <w:rFonts w:ascii="Menlo" w:hAnsi="Menlo" w:cs="Menlo"/>
-          <w:b/>
-          <w:bCs/>
-          <w:color w:val="2FB41D"/>
-          <w:kern w:val="0"/>
-          <w:szCs w:val="22"/>
-        </w:rPr>
-        <w:t>raspberrypi</w:t>
-      </w:r>
-      <w:r>
-        <w:rPr>
-          <w:rFonts w:ascii="Menlo" w:hAnsi="Menlo" w:cs="Menlo"/>
-          <w:color w:val="000000"/>
-          <w:kern w:val="0"/>
-          <w:szCs w:val="22"/>
-        </w:rPr>
-        <w:t>:</w:t>
-      </w:r>
-      <w:r>
-        <w:rPr>
-          <w:rFonts w:ascii="Menlo" w:hAnsi="Menlo" w:cs="Menlo"/>
-          <w:b/>
-          <w:bCs/>
-          <w:color w:val="400BD9"/>
-          <w:kern w:val="0"/>
-          <w:szCs w:val="22"/>
-        </w:rPr>
-        <w:t>~</w:t>
-      </w:r>
-      <w:proofErr w:type="gramEnd"/>
-      <w:r>
-        <w:rPr>
-          <w:rFonts w:ascii="Menlo" w:hAnsi="Menlo" w:cs="Menlo"/>
-          <w:b/>
-          <w:bCs/>
-          <w:color w:val="400BD9"/>
-          <w:kern w:val="0"/>
-          <w:szCs w:val="22"/>
-        </w:rPr>
-        <w:t>/labs/lab0 $</w:t>
-      </w:r>
-      <w:r>
-        <w:rPr>
-          <w:rFonts w:ascii="Menlo" w:hAnsi="Menlo" w:cs="Menlo"/>
-          <w:color w:val="000000"/>
-          <w:kern w:val="0"/>
-          <w:szCs w:val="22"/>
-        </w:rPr>
-        <w:t xml:space="preserve"> bash ./lab0_2.sh</w:t>
+          <w:color w:val="000000"/>
+          <w:kern w:val="0"/>
+          <w:szCs w:val="22"/>
+        </w:rPr>
+        <w:t>total 16</w:t>
       </w:r>
     </w:p>
     <w:p>
@@ -2665,14 +2673,45 @@
           <w:szCs w:val="22"/>
         </w:rPr>
       </w:pPr>
-      <w:r>
-        <w:rPr>
-          <w:rFonts w:ascii="Menlo" w:hAnsi="Menlo" w:cs="Menlo"/>
-          <w:color w:val="000000"/>
-          <w:kern w:val="0"/>
-          <w:szCs w:val="22"/>
-        </w:rPr>
-        <w:t>"</w:t>
+      <w:proofErr w:type="spellStart"/>
+      <w:r>
+        <w:rPr>
+          <w:rFonts w:ascii="Menlo" w:hAnsi="Menlo" w:cs="Menlo"/>
+          <w:color w:val="000000"/>
+          <w:kern w:val="0"/>
+          <w:szCs w:val="22"/>
+        </w:rPr>
+        <w:t>drwxr</w:t>
+      </w:r>
+      <w:proofErr w:type="spellEnd"/>
+      <w:r>
+        <w:rPr>
+          <w:rFonts w:ascii="Menlo" w:hAnsi="Menlo" w:cs="Menlo"/>
+          <w:color w:val="000000"/>
+          <w:kern w:val="0"/>
+          <w:szCs w:val="22"/>
+        </w:rPr>
+        <w:t>-</w:t>
+      </w:r>
+      <w:proofErr w:type="spellStart"/>
+      <w:r>
+        <w:rPr>
+          <w:rFonts w:ascii="Menlo" w:hAnsi="Menlo" w:cs="Menlo"/>
+          <w:color w:val="000000"/>
+          <w:kern w:val="0"/>
+          <w:szCs w:val="22"/>
+        </w:rPr>
+        <w:t>xr</w:t>
+      </w:r>
+      <w:proofErr w:type="spellEnd"/>
+      <w:r>
+        <w:rPr>
+          <w:rFonts w:ascii="Menlo" w:hAnsi="Menlo" w:cs="Menlo"/>
+          <w:color w:val="000000"/>
+          <w:kern w:val="0"/>
+          <w:szCs w:val="22"/>
+        </w:rPr>
+        <w:t xml:space="preserve">-x 2 2351610105 2351610105 4096 Mar 16 </w:t>
       </w:r>
       <w:proofErr w:type="gramStart"/>
       <w:r>
@@ -2682,18 +2721,9 @@
           <w:kern w:val="0"/>
           <w:szCs w:val="22"/>
         </w:rPr>
-        <w:t>current</w:t>
+        <w:t>14:15 .</w:t>
       </w:r>
       <w:proofErr w:type="gramEnd"/>
-      <w:r>
-        <w:rPr>
-          <w:rFonts w:ascii="Menlo" w:hAnsi="Menlo" w:cs="Menlo"/>
-          <w:color w:val="000000"/>
-          <w:kern w:val="0"/>
-          <w:szCs w:val="22"/>
-        </w:rPr>
-        <w:t xml:space="preserve"> path:"</w:t>
-      </w:r>
     </w:p>
     <w:p>
       <w:pPr>
@@ -2722,15 +2752,57 @@
           <w:szCs w:val="22"/>
         </w:rPr>
       </w:pPr>
-      <w:r>
-        <w:rPr>
-          <w:rFonts w:ascii="Menlo" w:hAnsi="Menlo" w:cs="Menlo"/>
-          <w:color w:val="000000"/>
-          <w:kern w:val="0"/>
-          <w:szCs w:val="22"/>
-        </w:rPr>
-        <w:t>/home/2351610105/labs/lab0</w:t>
-      </w:r>
+      <w:proofErr w:type="spellStart"/>
+      <w:r>
+        <w:rPr>
+          <w:rFonts w:ascii="Menlo" w:hAnsi="Menlo" w:cs="Menlo"/>
+          <w:color w:val="000000"/>
+          <w:kern w:val="0"/>
+          <w:szCs w:val="22"/>
+        </w:rPr>
+        <w:t>drwxr</w:t>
+      </w:r>
+      <w:proofErr w:type="spellEnd"/>
+      <w:r>
+        <w:rPr>
+          <w:rFonts w:ascii="Menlo" w:hAnsi="Menlo" w:cs="Menlo"/>
+          <w:color w:val="000000"/>
+          <w:kern w:val="0"/>
+          <w:szCs w:val="22"/>
+        </w:rPr>
+        <w:t>-</w:t>
+      </w:r>
+      <w:proofErr w:type="spellStart"/>
+      <w:r>
+        <w:rPr>
+          <w:rFonts w:ascii="Menlo" w:hAnsi="Menlo" w:cs="Menlo"/>
+          <w:color w:val="000000"/>
+          <w:kern w:val="0"/>
+          <w:szCs w:val="22"/>
+        </w:rPr>
+        <w:t>xr</w:t>
+      </w:r>
+      <w:proofErr w:type="spellEnd"/>
+      <w:r>
+        <w:rPr>
+          <w:rFonts w:ascii="Menlo" w:hAnsi="Menlo" w:cs="Menlo"/>
+          <w:color w:val="000000"/>
+          <w:kern w:val="0"/>
+          <w:szCs w:val="22"/>
+        </w:rPr>
+        <w:t>-x 3 2351610105 2351610105 4096 Mar 16 14:08</w:t>
+      </w:r>
+      <w:proofErr w:type="gramStart"/>
+      <w:r>
+        <w:rPr>
+          <w:rFonts w:ascii="Menlo" w:hAnsi="Menlo" w:cs="Menlo"/>
+          <w:color w:val="000000"/>
+          <w:kern w:val="0"/>
+          <w:szCs w:val="22"/>
+        </w:rPr>
+        <w:t xml:space="preserve"> ..</w:t>
+      </w:r>
+      <w:proofErr w:type="gramEnd"/>
     </w:p>
     <w:p>
       <w:pPr>
@@ -2766,27 +2838,27 @@
           <w:kern w:val="0"/>
           <w:szCs w:val="22"/>
         </w:rPr>
-        <w:t>"</w:t>
-      </w:r>
-      <w:proofErr w:type="gramStart"/>
-      <w:r>
-        <w:rPr>
-          <w:rFonts w:ascii="Menlo" w:hAnsi="Menlo" w:cs="Menlo"/>
-          <w:color w:val="000000"/>
-          <w:kern w:val="0"/>
-          <w:szCs w:val="22"/>
-        </w:rPr>
-        <w:t>file</w:t>
-      </w:r>
-      <w:proofErr w:type="gramEnd"/>
-      <w:r>
-        <w:rPr>
-          <w:rFonts w:ascii="Menlo" w:hAnsi="Menlo" w:cs="Menlo"/>
-          <w:color w:val="000000"/>
-          <w:kern w:val="0"/>
-          <w:szCs w:val="22"/>
-        </w:rPr>
-        <w:t xml:space="preserve"> list:"</w:t>
+        <w:t>-</w:t>
+      </w:r>
+      <w:proofErr w:type="spellStart"/>
+      <w:r>
+        <w:rPr>
+          <w:rFonts w:ascii="Menlo" w:hAnsi="Menlo" w:cs="Menlo"/>
+          <w:color w:val="000000"/>
+          <w:kern w:val="0"/>
+          <w:szCs w:val="22"/>
+        </w:rPr>
+        <w:t>rw</w:t>
+      </w:r>
+      <w:proofErr w:type="spellEnd"/>
+      <w:r>
+        <w:rPr>
+          <w:rFonts w:ascii="Menlo" w:hAnsi="Menlo" w:cs="Menlo"/>
+          <w:color w:val="000000"/>
+          <w:kern w:val="0"/>
+          <w:szCs w:val="22"/>
+        </w:rPr>
+        <w:t>-r--r-- 1 2351610105 2351610105   19 Mar 16 14:13 lab0_1.sh</w:t>
       </w:r>
     </w:p>
     <w:p>
@@ -2823,7 +2895,27 @@
           <w:kern w:val="0"/>
           <w:szCs w:val="22"/>
         </w:rPr>
-        <w:t>total 16</w:t>
+        <w:t>-</w:t>
+      </w:r>
+      <w:proofErr w:type="spellStart"/>
+      <w:r>
+        <w:rPr>
+          <w:rFonts w:ascii="Menlo" w:hAnsi="Menlo" w:cs="Menlo"/>
+          <w:color w:val="000000"/>
+          <w:kern w:val="0"/>
+          <w:szCs w:val="22"/>
+        </w:rPr>
+        <w:t>rw</w:t>
+      </w:r>
+      <w:proofErr w:type="spellEnd"/>
+      <w:r>
+        <w:rPr>
+          <w:rFonts w:ascii="Menlo" w:hAnsi="Menlo" w:cs="Menlo"/>
+          <w:color w:val="000000"/>
+          <w:kern w:val="0"/>
+          <w:szCs w:val="22"/>
+        </w:rPr>
+        <w:t>-r--r-- 1 2351610105 2351610105   54 Mar 16 14:16 lab0_2.sh</w:t>
       </w:r>
     </w:p>
     <w:p>
@@ -2853,6 +2945,70 @@
           <w:szCs w:val="22"/>
         </w:rPr>
       </w:pPr>
+      <w:r>
+        <w:rPr>
+          <w:rFonts w:ascii="Menlo" w:hAnsi="Menlo" w:cs="Menlo"/>
+          <w:b/>
+          <w:bCs/>
+          <w:color w:val="2FB41D"/>
+          <w:kern w:val="0"/>
+          <w:szCs w:val="22"/>
+        </w:rPr>
+        <w:t>2351610105@</w:t>
+      </w:r>
+      <w:proofErr w:type="gramStart"/>
+      <w:r>
+        <w:rPr>
+          <w:rFonts w:ascii="Menlo" w:hAnsi="Menlo" w:cs="Menlo"/>
+          <w:b/>
+          <w:bCs/>
+          <w:color w:val="2FB41D"/>
+          <w:kern w:val="0"/>
+          <w:szCs w:val="22"/>
+        </w:rPr>
+        <w:t>raspberrypi</w:t>
+      </w:r>
+      <w:r>
+        <w:rPr>
+          <w:rFonts w:ascii="Menlo" w:hAnsi="Menlo" w:cs="Menlo"/>
+          <w:color w:val="000000"/>
+          <w:kern w:val="0"/>
+          <w:szCs w:val="22"/>
+        </w:rPr>
+        <w:t>:</w:t>
+      </w:r>
+      <w:r>
+        <w:rPr>
+          <w:rFonts w:ascii="Menlo" w:hAnsi="Menlo" w:cs="Menlo"/>
+          <w:b/>
+          <w:bCs/>
+          <w:color w:val="400BD9"/>
+          <w:kern w:val="0"/>
+          <w:szCs w:val="22"/>
+        </w:rPr>
+        <w:t>~</w:t>
+      </w:r>
+      <w:proofErr w:type="gramEnd"/>
+      <w:r>
+        <w:rPr>
+          <w:rFonts w:ascii="Menlo" w:hAnsi="Menlo" w:cs="Menlo"/>
+          <w:b/>
+          <w:bCs/>
+          <w:color w:val="400BD9"/>
+          <w:kern w:val="0"/>
+          <w:szCs w:val="22"/>
+        </w:rPr>
+        <w:t>/labs/lab0 $</w:t>
+      </w:r>
+      <w:r>
+        <w:rPr>
+          <w:rFonts w:ascii="Menlo" w:hAnsi="Menlo" w:cs="Menlo"/>
+          <w:color w:val="000000"/>
+          <w:kern w:val="0"/>
+          <w:szCs w:val="22"/>
+        </w:rPr>
+        <w:t xml:space="preserve"> </w:t>
+      </w:r>
       <w:proofErr w:type="spellStart"/>
       <w:r>
         <w:rPr>
@@ -2861,7 +3017,7 @@
           <w:kern w:val="0"/>
           <w:szCs w:val="22"/>
         </w:rPr>
-        <w:t>drwxr</w:t>
+        <w:t>mkdir</w:t>
       </w:r>
       <w:proofErr w:type="spellEnd"/>
       <w:r>
@@ -2871,39 +3027,8 @@
           <w:kern w:val="0"/>
           <w:szCs w:val="22"/>
         </w:rPr>
-        <w:t>-</w:t>
-      </w:r>
-      <w:proofErr w:type="spellStart"/>
-      <w:r>
-        <w:rPr>
-          <w:rFonts w:ascii="Menlo" w:hAnsi="Menlo" w:cs="Menlo"/>
-          <w:color w:val="000000"/>
-          <w:kern w:val="0"/>
-          <w:szCs w:val="22"/>
-        </w:rPr>
-        <w:t>xr</w:t>
-      </w:r>
-      <w:proofErr w:type="spellEnd"/>
-      <w:r>
-        <w:rPr>
-          <w:rFonts w:ascii="Menlo" w:hAnsi="Menlo" w:cs="Menlo"/>
-          <w:color w:val="000000"/>
-          <w:kern w:val="0"/>
-          <w:szCs w:val="22"/>
-        </w:rPr>
-        <w:t xml:space="preserve">-x 2 2351610105 2351610105 4096 Mar 16 </w:t>
-      </w:r>
-      <w:proofErr w:type="gramStart"/>
-      <w:r>
-        <w:rPr>
-          <w:rFonts w:ascii="Menlo" w:hAnsi="Menlo" w:cs="Menlo"/>
-          <w:color w:val="000000"/>
-          <w:kern w:val="0"/>
-          <w:szCs w:val="22"/>
-        </w:rPr>
-        <w:t>14:15 .</w:t>
-      </w:r>
-      <w:proofErr w:type="gramEnd"/>
+        <w:t xml:space="preserve"> practice</w:t>
+      </w:r>
     </w:p>
     <w:p>
       <w:pPr>
@@ -2932,57 +3057,70 @@
           <w:szCs w:val="22"/>
         </w:rPr>
       </w:pPr>
-      <w:proofErr w:type="spellStart"/>
-      <w:r>
-        <w:rPr>
-          <w:rFonts w:ascii="Menlo" w:hAnsi="Menlo" w:cs="Menlo"/>
-          <w:color w:val="000000"/>
-          <w:kern w:val="0"/>
-          <w:szCs w:val="22"/>
-        </w:rPr>
-        <w:t>drwxr</w:t>
-      </w:r>
-      <w:proofErr w:type="spellEnd"/>
-      <w:r>
-        <w:rPr>
-          <w:rFonts w:ascii="Menlo" w:hAnsi="Menlo" w:cs="Menlo"/>
-          <w:color w:val="000000"/>
-          <w:kern w:val="0"/>
-          <w:szCs w:val="22"/>
-        </w:rPr>
-        <w:t>-</w:t>
-      </w:r>
-      <w:proofErr w:type="spellStart"/>
-      <w:r>
-        <w:rPr>
-          <w:rFonts w:ascii="Menlo" w:hAnsi="Menlo" w:cs="Menlo"/>
-          <w:color w:val="000000"/>
-          <w:kern w:val="0"/>
-          <w:szCs w:val="22"/>
-        </w:rPr>
-        <w:t>xr</w:t>
-      </w:r>
-      <w:proofErr w:type="spellEnd"/>
-      <w:r>
-        <w:rPr>
-          <w:rFonts w:ascii="Menlo" w:hAnsi="Menlo" w:cs="Menlo"/>
-          <w:color w:val="000000"/>
-          <w:kern w:val="0"/>
-          <w:szCs w:val="22"/>
-        </w:rPr>
-        <w:t>-x 3 2351610105 2351610105 4096 Mar 16 14:08</w:t>
+      <w:r>
+        <w:rPr>
+          <w:rFonts w:ascii="Menlo" w:hAnsi="Menlo" w:cs="Menlo"/>
+          <w:b/>
+          <w:bCs/>
+          <w:color w:val="2FB41D"/>
+          <w:kern w:val="0"/>
+          <w:szCs w:val="22"/>
+        </w:rPr>
+        <w:t>2351610105@</w:t>
       </w:r>
       <w:proofErr w:type="gramStart"/>
       <w:r>
         <w:rPr>
           <w:rFonts w:ascii="Menlo" w:hAnsi="Menlo" w:cs="Menlo"/>
-          <w:color w:val="000000"/>
-          <w:kern w:val="0"/>
-          <w:szCs w:val="22"/>
-        </w:rPr>
-        <w:t xml:space="preserve"> ..</w:t>
+          <w:b/>
+          <w:bCs/>
+          <w:color w:val="2FB41D"/>
+          <w:kern w:val="0"/>
+          <w:szCs w:val="22"/>
+        </w:rPr>
+        <w:t>raspberrypi</w:t>
+      </w:r>
+      <w:r>
+        <w:rPr>
+          <w:rFonts w:ascii="Menlo" w:hAnsi="Menlo" w:cs="Menlo"/>
+          <w:color w:val="000000"/>
+          <w:kern w:val="0"/>
+          <w:szCs w:val="22"/>
+        </w:rPr>
+        <w:t>:</w:t>
+      </w:r>
+      <w:r>
+        <w:rPr>
+          <w:rFonts w:ascii="Menlo" w:hAnsi="Menlo" w:cs="Menlo"/>
+          <w:b/>
+          <w:bCs/>
+          <w:color w:val="400BD9"/>
+          <w:kern w:val="0"/>
+          <w:szCs w:val="22"/>
+        </w:rPr>
+        <w:t>~</w:t>
       </w:r>
       <w:proofErr w:type="gramEnd"/>
+      <w:r>
+        <w:rPr>
+          <w:rFonts w:ascii="Menlo" w:hAnsi="Menlo" w:cs="Menlo"/>
+          <w:b/>
+          <w:bCs/>
+          <w:color w:val="400BD9"/>
+          <w:kern w:val="0"/>
+          <w:szCs w:val="22"/>
+        </w:rPr>
+        <w:t>/labs/lab0 $</w:t>
+      </w:r>
+      <w:r>
+        <w:rPr>
+          <w:rFonts w:ascii="Menlo" w:hAnsi="Menlo" w:cs="Menlo"/>
+          <w:color w:val="000000"/>
+          <w:kern w:val="0"/>
+          <w:szCs w:val="22"/>
+        </w:rPr>
+        <w:t xml:space="preserve"> cd practice</w:t>
+      </w:r>
     </w:p>
     <w:p>
       <w:pPr>
@@ -3014,31 +3152,66 @@
       <w:r>
         <w:rPr>
           <w:rFonts w:ascii="Menlo" w:hAnsi="Menlo" w:cs="Menlo"/>
-          <w:color w:val="000000"/>
-          <w:kern w:val="0"/>
-          <w:szCs w:val="22"/>
-        </w:rPr>
-        <w:t>-</w:t>
-      </w:r>
-      <w:proofErr w:type="spellStart"/>
-      <w:r>
-        <w:rPr>
-          <w:rFonts w:ascii="Menlo" w:hAnsi="Menlo" w:cs="Menlo"/>
-          <w:color w:val="000000"/>
-          <w:kern w:val="0"/>
-          <w:szCs w:val="22"/>
-        </w:rPr>
-        <w:t>rw</w:t>
-      </w:r>
-      <w:proofErr w:type="spellEnd"/>
-      <w:r>
-        <w:rPr>
-          <w:rFonts w:ascii="Menlo" w:hAnsi="Menlo" w:cs="Menlo"/>
-          <w:color w:val="000000"/>
-          <w:kern w:val="0"/>
-          <w:szCs w:val="22"/>
-        </w:rPr>
-        <w:t>-r--r-- 1 2351610105 2351610105   19 Mar 16 14:13 lab0_1.sh</w:t>
+          <w:b/>
+          <w:bCs/>
+          <w:color w:val="2FB41D"/>
+          <w:kern w:val="0"/>
+          <w:szCs w:val="22"/>
+        </w:rPr>
+        <w:t>2351610105@</w:t>
+      </w:r>
+      <w:proofErr w:type="gramStart"/>
+      <w:r>
+        <w:rPr>
+          <w:rFonts w:ascii="Menlo" w:hAnsi="Menlo" w:cs="Menlo"/>
+          <w:b/>
+          <w:bCs/>
+          <w:color w:val="2FB41D"/>
+          <w:kern w:val="0"/>
+          <w:szCs w:val="22"/>
+        </w:rPr>
+        <w:t>raspberrypi</w:t>
+      </w:r>
+      <w:r>
+        <w:rPr>
+          <w:rFonts w:ascii="Menlo" w:hAnsi="Menlo" w:cs="Menlo"/>
+          <w:color w:val="000000"/>
+          <w:kern w:val="0"/>
+          <w:szCs w:val="22"/>
+        </w:rPr>
+        <w:t>:</w:t>
+      </w:r>
+      <w:r>
+        <w:rPr>
+          <w:rFonts w:ascii="Menlo" w:hAnsi="Menlo" w:cs="Menlo"/>
+          <w:b/>
+          <w:bCs/>
+          <w:color w:val="400BD9"/>
+          <w:kern w:val="0"/>
+          <w:szCs w:val="22"/>
+        </w:rPr>
+        <w:t>~</w:t>
+      </w:r>
+      <w:proofErr w:type="gramEnd"/>
+      <w:r>
+        <w:rPr>
+          <w:rFonts w:ascii="Menlo" w:hAnsi="Menlo" w:cs="Menlo"/>
+          <w:b/>
+          <w:bCs/>
+          <w:color w:val="400BD9"/>
+          <w:kern w:val="0"/>
+          <w:szCs w:val="22"/>
+        </w:rPr>
+        <w:t>/labs/lab0/practice $</w:t>
+      </w:r>
+      <w:r>
+        <w:rPr>
+          <w:rFonts w:ascii="Menlo" w:hAnsi="Menlo" w:cs="Menlo"/>
+          <w:color w:val="000000"/>
+          <w:kern w:val="0"/>
+          <w:szCs w:val="22"/>
+        </w:rPr>
+        <w:t xml:space="preserve"> touch a.txt</w:t>
       </w:r>
     </w:p>
     <w:p>
@@ -3071,31 +3244,66 @@
       <w:r>
         <w:rPr>
           <w:rFonts w:ascii="Menlo" w:hAnsi="Menlo" w:cs="Menlo"/>
-          <w:color w:val="000000"/>
-          <w:kern w:val="0"/>
-          <w:szCs w:val="22"/>
-        </w:rPr>
-        <w:t>-</w:t>
-      </w:r>
-      <w:proofErr w:type="spellStart"/>
-      <w:r>
-        <w:rPr>
-          <w:rFonts w:ascii="Menlo" w:hAnsi="Menlo" w:cs="Menlo"/>
-          <w:color w:val="000000"/>
-          <w:kern w:val="0"/>
-          <w:szCs w:val="22"/>
-        </w:rPr>
-        <w:t>rw</w:t>
-      </w:r>
-      <w:proofErr w:type="spellEnd"/>
-      <w:r>
-        <w:rPr>
-          <w:rFonts w:ascii="Menlo" w:hAnsi="Menlo" w:cs="Menlo"/>
-          <w:color w:val="000000"/>
-          <w:kern w:val="0"/>
-          <w:szCs w:val="22"/>
-        </w:rPr>
-        <w:t>-r--r-- 1 2351610105 2351610105   54 Mar 16 14:16 lab0_2.sh</w:t>
+          <w:b/>
+          <w:bCs/>
+          <w:color w:val="2FB41D"/>
+          <w:kern w:val="0"/>
+          <w:szCs w:val="22"/>
+        </w:rPr>
+        <w:t>2351610105@</w:t>
+      </w:r>
+      <w:proofErr w:type="gramStart"/>
+      <w:r>
+        <w:rPr>
+          <w:rFonts w:ascii="Menlo" w:hAnsi="Menlo" w:cs="Menlo"/>
+          <w:b/>
+          <w:bCs/>
+          <w:color w:val="2FB41D"/>
+          <w:kern w:val="0"/>
+          <w:szCs w:val="22"/>
+        </w:rPr>
+        <w:t>raspberrypi</w:t>
+      </w:r>
+      <w:r>
+        <w:rPr>
+          <w:rFonts w:ascii="Menlo" w:hAnsi="Menlo" w:cs="Menlo"/>
+          <w:color w:val="000000"/>
+          <w:kern w:val="0"/>
+          <w:szCs w:val="22"/>
+        </w:rPr>
+        <w:t>:</w:t>
+      </w:r>
+      <w:r>
+        <w:rPr>
+          <w:rFonts w:ascii="Menlo" w:hAnsi="Menlo" w:cs="Menlo"/>
+          <w:b/>
+          <w:bCs/>
+          <w:color w:val="400BD9"/>
+          <w:kern w:val="0"/>
+          <w:szCs w:val="22"/>
+        </w:rPr>
+        <w:t>~</w:t>
+      </w:r>
+      <w:proofErr w:type="gramEnd"/>
+      <w:r>
+        <w:rPr>
+          <w:rFonts w:ascii="Menlo" w:hAnsi="Menlo" w:cs="Menlo"/>
+          <w:b/>
+          <w:bCs/>
+          <w:color w:val="400BD9"/>
+          <w:kern w:val="0"/>
+          <w:szCs w:val="22"/>
+        </w:rPr>
+        <w:t>/labs/lab0/practice $</w:t>
+      </w:r>
+      <w:r>
+        <w:rPr>
+          <w:rFonts w:ascii="Menlo" w:hAnsi="Menlo" w:cs="Menlo"/>
+          <w:color w:val="000000"/>
+          <w:kern w:val="0"/>
+          <w:szCs w:val="22"/>
+        </w:rPr>
+        <w:t xml:space="preserve"> touch b.txt</w:t>
       </w:r>
     </w:p>
     <w:p>
@@ -3178,36 +3386,16 @@
           <w:kern w:val="0"/>
           <w:szCs w:val="22"/>
         </w:rPr>
-        <w:t>/labs/lab0 $</w:t>
-      </w:r>
-      <w:r>
-        <w:rPr>
-          <w:rFonts w:ascii="Menlo" w:hAnsi="Menlo" w:cs="Menlo"/>
-          <w:color w:val="000000"/>
-          <w:kern w:val="0"/>
-          <w:szCs w:val="22"/>
-        </w:rPr>
-        <w:t xml:space="preserve"> </w:t>
-      </w:r>
-      <w:proofErr w:type="spellStart"/>
-      <w:r>
-        <w:rPr>
-          <w:rFonts w:ascii="Menlo" w:hAnsi="Menlo" w:cs="Menlo"/>
-          <w:color w:val="000000"/>
-          <w:kern w:val="0"/>
-          <w:szCs w:val="22"/>
-        </w:rPr>
-        <w:t>mkdir</w:t>
-      </w:r>
-      <w:proofErr w:type="spellEnd"/>
-      <w:r>
-        <w:rPr>
-          <w:rFonts w:ascii="Menlo" w:hAnsi="Menlo" w:cs="Menlo"/>
-          <w:color w:val="000000"/>
-          <w:kern w:val="0"/>
-          <w:szCs w:val="22"/>
-        </w:rPr>
-        <w:t xml:space="preserve"> practice</w:t>
+        <w:t>/labs/lab0/practice $</w:t>
+      </w:r>
+      <w:r>
+        <w:rPr>
+          <w:rFonts w:ascii="Menlo" w:hAnsi="Menlo" w:cs="Menlo"/>
+          <w:color w:val="000000"/>
+          <w:kern w:val="0"/>
+          <w:szCs w:val="22"/>
+        </w:rPr>
+        <w:t xml:space="preserve"> cp a.txt a_copy.txt</w:t>
       </w:r>
     </w:p>
     <w:p>
@@ -3290,16 +3478,16 @@
           <w:kern w:val="0"/>
           <w:szCs w:val="22"/>
         </w:rPr>
-        <w:t>/labs/lab0 $</w:t>
-      </w:r>
-      <w:r>
-        <w:rPr>
-          <w:rFonts w:ascii="Menlo" w:hAnsi="Menlo" w:cs="Menlo"/>
-          <w:color w:val="000000"/>
-          <w:kern w:val="0"/>
-          <w:szCs w:val="22"/>
-        </w:rPr>
-        <w:t xml:space="preserve"> cd practice</w:t>
+        <w:t>/labs/lab0/practice $</w:t>
+      </w:r>
+      <w:r>
+        <w:rPr>
+          <w:rFonts w:ascii="Menlo" w:hAnsi="Menlo" w:cs="Menlo"/>
+          <w:color w:val="000000"/>
+          <w:kern w:val="0"/>
+          <w:szCs w:val="22"/>
+        </w:rPr>
+        <w:t xml:space="preserve"> mv b.txt b_renamed.txt</w:t>
       </w:r>
     </w:p>
     <w:p>
@@ -3391,7 +3579,7 @@
           <w:kern w:val="0"/>
           <w:szCs w:val="22"/>
         </w:rPr>
-        <w:t xml:space="preserve"> touch a.txt</w:t>
+        <w:t xml:space="preserve"> ls -la</w:t>
       </w:r>
     </w:p>
     <w:p>
@@ -3424,66 +3612,11 @@
       <w:r>
         <w:rPr>
           <w:rFonts w:ascii="Menlo" w:hAnsi="Menlo" w:cs="Menlo"/>
-          <w:b/>
-          <w:bCs/>
-          <w:color w:val="2FB41D"/>
-          <w:kern w:val="0"/>
-          <w:szCs w:val="22"/>
-        </w:rPr>
-        <w:t>2351610105@</w:t>
-      </w:r>
-      <w:proofErr w:type="gramStart"/>
-      <w:r>
-        <w:rPr>
-          <w:rFonts w:ascii="Menlo" w:hAnsi="Menlo" w:cs="Menlo"/>
-          <w:b/>
-          <w:bCs/>
-          <w:color w:val="2FB41D"/>
-          <w:kern w:val="0"/>
-          <w:szCs w:val="22"/>
-        </w:rPr>
-        <w:t>raspberrypi</w:t>
-      </w:r>
-      <w:r>
-        <w:rPr>
-          <w:rFonts w:ascii="Menlo" w:hAnsi="Menlo" w:cs="Menlo"/>
-          <w:color w:val="000000"/>
-          <w:kern w:val="0"/>
-          <w:szCs w:val="22"/>
-        </w:rPr>
-        <w:t>:</w:t>
-      </w:r>
-      <w:r>
-        <w:rPr>
-          <w:rFonts w:ascii="Menlo" w:hAnsi="Menlo" w:cs="Menlo"/>
-          <w:b/>
-          <w:bCs/>
-          <w:color w:val="400BD9"/>
-          <w:kern w:val="0"/>
-          <w:szCs w:val="22"/>
-        </w:rPr>
-        <w:t>~</w:t>
-      </w:r>
-      <w:proofErr w:type="gramEnd"/>
-      <w:r>
-        <w:rPr>
-          <w:rFonts w:ascii="Menlo" w:hAnsi="Menlo" w:cs="Menlo"/>
-          <w:b/>
-          <w:bCs/>
-          <w:color w:val="400BD9"/>
-          <w:kern w:val="0"/>
-          <w:szCs w:val="22"/>
-        </w:rPr>
-        <w:t>/labs/lab0/practice $</w:t>
-      </w:r>
-      <w:r>
-        <w:rPr>
-          <w:rFonts w:ascii="Menlo" w:hAnsi="Menlo" w:cs="Menlo"/>
-          <w:color w:val="000000"/>
-          <w:kern w:val="0"/>
-          <w:szCs w:val="22"/>
-        </w:rPr>
-        <w:t xml:space="preserve"> touch b.txt</w:t>
+          <w:color w:val="000000"/>
+          <w:kern w:val="0"/>
+          <w:szCs w:val="22"/>
+        </w:rPr>
+        <w:t>total 8</w:t>
       </w:r>
     </w:p>
     <w:p>
@@ -3513,70 +3646,68 @@
           <w:szCs w:val="22"/>
         </w:rPr>
       </w:pPr>
-      <w:r>
-        <w:rPr>
-          <w:rFonts w:ascii="Menlo" w:hAnsi="Menlo" w:cs="Menlo"/>
-          <w:b/>
-          <w:bCs/>
-          <w:color w:val="2FB41D"/>
-          <w:kern w:val="0"/>
-          <w:szCs w:val="22"/>
-        </w:rPr>
-        <w:t>2351610105@</w:t>
+      <w:proofErr w:type="spellStart"/>
+      <w:r>
+        <w:rPr>
+          <w:rFonts w:ascii="Menlo" w:hAnsi="Menlo" w:cs="Menlo"/>
+          <w:color w:val="000000"/>
+          <w:kern w:val="0"/>
+          <w:szCs w:val="22"/>
+        </w:rPr>
+        <w:t>drwxr</w:t>
+      </w:r>
+      <w:proofErr w:type="spellEnd"/>
+      <w:r>
+        <w:rPr>
+          <w:rFonts w:ascii="Menlo" w:hAnsi="Menlo" w:cs="Menlo"/>
+          <w:color w:val="000000"/>
+          <w:kern w:val="0"/>
+          <w:szCs w:val="22"/>
+        </w:rPr>
+        <w:t>-</w:t>
+      </w:r>
+      <w:proofErr w:type="spellStart"/>
+      <w:r>
+        <w:rPr>
+          <w:rFonts w:ascii="Menlo" w:hAnsi="Menlo" w:cs="Menlo"/>
+          <w:color w:val="000000"/>
+          <w:kern w:val="0"/>
+          <w:szCs w:val="22"/>
+        </w:rPr>
+        <w:t>xr</w:t>
+      </w:r>
+      <w:proofErr w:type="spellEnd"/>
+      <w:r>
+        <w:rPr>
+          <w:rFonts w:ascii="Menlo" w:hAnsi="Menlo" w:cs="Menlo"/>
+          <w:color w:val="000000"/>
+          <w:kern w:val="0"/>
+          <w:szCs w:val="22"/>
+        </w:rPr>
+        <w:t xml:space="preserve">-x 2 2351610105 2351610105 4096 Mar 16 </w:t>
       </w:r>
       <w:proofErr w:type="gramStart"/>
       <w:r>
         <w:rPr>
           <w:rFonts w:ascii="Menlo" w:hAnsi="Menlo" w:cs="Menlo"/>
-          <w:b/>
-          <w:bCs/>
-          <w:color w:val="2FB41D"/>
-          <w:kern w:val="0"/>
-          <w:szCs w:val="22"/>
-        </w:rPr>
-        <w:t>raspberrypi</w:t>
-      </w:r>
-      <w:r>
-        <w:rPr>
-          <w:rFonts w:ascii="Menlo" w:hAnsi="Menlo" w:cs="Menlo"/>
-          <w:color w:val="000000"/>
-          <w:kern w:val="0"/>
-          <w:szCs w:val="22"/>
-        </w:rPr>
-        <w:t>:</w:t>
-      </w:r>
-      <w:r>
-        <w:rPr>
-          <w:rFonts w:ascii="Menlo" w:hAnsi="Menlo" w:cs="Menlo"/>
-          <w:b/>
-          <w:bCs/>
-          <w:color w:val="400BD9"/>
-          <w:kern w:val="0"/>
-          <w:szCs w:val="22"/>
-        </w:rPr>
-        <w:t>~</w:t>
+          <w:color w:val="000000"/>
+          <w:kern w:val="0"/>
+          <w:szCs w:val="22"/>
+        </w:rPr>
+        <w:t xml:space="preserve">14:19 </w:t>
+      </w:r>
+      <w:r>
+        <w:rPr>
+          <w:rFonts w:ascii="Menlo" w:hAnsi="Menlo" w:cs="Menlo"/>
+          <w:b/>
+          <w:bCs/>
+          <w:color w:val="400BD9"/>
+          <w:kern w:val="0"/>
+          <w:szCs w:val="22"/>
+        </w:rPr>
+        <w:t>.</w:t>
       </w:r>
       <w:proofErr w:type="gramEnd"/>
-      <w:r>
-        <w:rPr>
-          <w:rFonts w:ascii="Menlo" w:hAnsi="Menlo" w:cs="Menlo"/>
-          <w:b/>
-          <w:bCs/>
-          <w:color w:val="400BD9"/>
-          <w:kern w:val="0"/>
-          <w:szCs w:val="22"/>
-        </w:rPr>
-        <w:t>/labs/lab0/practice $</w:t>
-      </w:r>
-      <w:r>
-        <w:rPr>
-          <w:rFonts w:ascii="Menlo" w:hAnsi="Menlo" w:cs="Menlo"/>
-          <w:color w:val="000000"/>
-          <w:kern w:val="0"/>
-          <w:szCs w:val="22"/>
-        </w:rPr>
-        <w:t xml:space="preserve"> cp a.txt a_copy.txt</w:t>
-      </w:r>
     </w:p>
     <w:p>
       <w:pPr>
@@ -3605,70 +3736,68 @@
           <w:szCs w:val="22"/>
         </w:rPr>
       </w:pPr>
-      <w:r>
-        <w:rPr>
-          <w:rFonts w:ascii="Menlo" w:hAnsi="Menlo" w:cs="Menlo"/>
-          <w:b/>
-          <w:bCs/>
-          <w:color w:val="2FB41D"/>
-          <w:kern w:val="0"/>
-          <w:szCs w:val="22"/>
-        </w:rPr>
-        <w:t>2351610105@</w:t>
+      <w:proofErr w:type="spellStart"/>
+      <w:r>
+        <w:rPr>
+          <w:rFonts w:ascii="Menlo" w:hAnsi="Menlo" w:cs="Menlo"/>
+          <w:color w:val="000000"/>
+          <w:kern w:val="0"/>
+          <w:szCs w:val="22"/>
+        </w:rPr>
+        <w:t>drwxr</w:t>
+      </w:r>
+      <w:proofErr w:type="spellEnd"/>
+      <w:r>
+        <w:rPr>
+          <w:rFonts w:ascii="Menlo" w:hAnsi="Menlo" w:cs="Menlo"/>
+          <w:color w:val="000000"/>
+          <w:kern w:val="0"/>
+          <w:szCs w:val="22"/>
+        </w:rPr>
+        <w:t>-</w:t>
+      </w:r>
+      <w:proofErr w:type="spellStart"/>
+      <w:r>
+        <w:rPr>
+          <w:rFonts w:ascii="Menlo" w:hAnsi="Menlo" w:cs="Menlo"/>
+          <w:color w:val="000000"/>
+          <w:kern w:val="0"/>
+          <w:szCs w:val="22"/>
+        </w:rPr>
+        <w:t>xr</w:t>
+      </w:r>
+      <w:proofErr w:type="spellEnd"/>
+      <w:r>
+        <w:rPr>
+          <w:rFonts w:ascii="Menlo" w:hAnsi="Menlo" w:cs="Menlo"/>
+          <w:color w:val="000000"/>
+          <w:kern w:val="0"/>
+          <w:szCs w:val="22"/>
+        </w:rPr>
+        <w:t>-x 3 2351610105 2351610105 4096 Mar 16 14:17</w:t>
       </w:r>
       <w:proofErr w:type="gramStart"/>
       <w:r>
         <w:rPr>
           <w:rFonts w:ascii="Menlo" w:hAnsi="Menlo" w:cs="Menlo"/>
-          <w:b/>
-          <w:bCs/>
-          <w:color w:val="2FB41D"/>
-          <w:kern w:val="0"/>
-          <w:szCs w:val="22"/>
-        </w:rPr>
-        <w:t>raspberrypi</w:t>
-      </w:r>
-      <w:r>
-        <w:rPr>
-          <w:rFonts w:ascii="Menlo" w:hAnsi="Menlo" w:cs="Menlo"/>
-          <w:color w:val="000000"/>
-          <w:kern w:val="0"/>
-          <w:szCs w:val="22"/>
-        </w:rPr>
-        <w:t>:</w:t>
-      </w:r>
-      <w:r>
-        <w:rPr>
-          <w:rFonts w:ascii="Menlo" w:hAnsi="Menlo" w:cs="Menlo"/>
-          <w:b/>
-          <w:bCs/>
-          <w:color w:val="400BD9"/>
-          <w:kern w:val="0"/>
-          <w:szCs w:val="22"/>
-        </w:rPr>
-        <w:t>~</w:t>
+          <w:color w:val="000000"/>
+          <w:kern w:val="0"/>
+          <w:szCs w:val="22"/>
+        </w:rPr>
+        <w:t xml:space="preserve"> </w:t>
+      </w:r>
+      <w:r>
+        <w:rPr>
+          <w:rFonts w:ascii="Menlo" w:hAnsi="Menlo" w:cs="Menlo"/>
+          <w:b/>
+          <w:bCs/>
+          <w:color w:val="400BD9"/>
+          <w:kern w:val="0"/>
+          <w:szCs w:val="22"/>
+        </w:rPr>
+        <w:t>..</w:t>
       </w:r>
       <w:proofErr w:type="gramEnd"/>
-      <w:r>
-        <w:rPr>
-          <w:rFonts w:ascii="Menlo" w:hAnsi="Menlo" w:cs="Menlo"/>
-          <w:b/>
-          <w:bCs/>
-          <w:color w:val="400BD9"/>
-          <w:kern w:val="0"/>
-          <w:szCs w:val="22"/>
-        </w:rPr>
-        <w:t>/labs/lab0/practice $</w:t>
-      </w:r>
-      <w:r>
-        <w:rPr>
-          <w:rFonts w:ascii="Menlo" w:hAnsi="Menlo" w:cs="Menlo"/>
-          <w:color w:val="000000"/>
-          <w:kern w:val="0"/>
-          <w:szCs w:val="22"/>
-        </w:rPr>
-        <w:t xml:space="preserve"> mv b.txt b_renamed.txt</w:t>
-      </w:r>
     </w:p>
     <w:p>
       <w:pPr>
@@ -3700,66 +3829,31 @@
       <w:r>
         <w:rPr>
           <w:rFonts w:ascii="Menlo" w:hAnsi="Menlo" w:cs="Menlo"/>
-          <w:b/>
-          <w:bCs/>
-          <w:color w:val="2FB41D"/>
-          <w:kern w:val="0"/>
-          <w:szCs w:val="22"/>
-        </w:rPr>
-        <w:t>2351610105@</w:t>
-      </w:r>
-      <w:proofErr w:type="gramStart"/>
-      <w:r>
-        <w:rPr>
-          <w:rFonts w:ascii="Menlo" w:hAnsi="Menlo" w:cs="Menlo"/>
-          <w:b/>
-          <w:bCs/>
-          <w:color w:val="2FB41D"/>
-          <w:kern w:val="0"/>
-          <w:szCs w:val="22"/>
-        </w:rPr>
-        <w:t>raspberrypi</w:t>
-      </w:r>
-      <w:r>
-        <w:rPr>
-          <w:rFonts w:ascii="Menlo" w:hAnsi="Menlo" w:cs="Menlo"/>
-          <w:color w:val="000000"/>
-          <w:kern w:val="0"/>
-          <w:szCs w:val="22"/>
-        </w:rPr>
-        <w:t>:</w:t>
-      </w:r>
-      <w:r>
-        <w:rPr>
-          <w:rFonts w:ascii="Menlo" w:hAnsi="Menlo" w:cs="Menlo"/>
-          <w:b/>
-          <w:bCs/>
-          <w:color w:val="400BD9"/>
-          <w:kern w:val="0"/>
-          <w:szCs w:val="22"/>
-        </w:rPr>
-        <w:t>~</w:t>
-      </w:r>
-      <w:proofErr w:type="gramEnd"/>
-      <w:r>
-        <w:rPr>
-          <w:rFonts w:ascii="Menlo" w:hAnsi="Menlo" w:cs="Menlo"/>
-          <w:b/>
-          <w:bCs/>
-          <w:color w:val="400BD9"/>
-          <w:kern w:val="0"/>
-          <w:szCs w:val="22"/>
-        </w:rPr>
-        <w:t>/labs/lab0/practice $</w:t>
-      </w:r>
-      <w:r>
-        <w:rPr>
-          <w:rFonts w:ascii="Menlo" w:hAnsi="Menlo" w:cs="Menlo"/>
-          <w:color w:val="000000"/>
-          <w:kern w:val="0"/>
-          <w:szCs w:val="22"/>
-        </w:rPr>
-        <w:t xml:space="preserve"> ls -la</w:t>
+          <w:color w:val="000000"/>
+          <w:kern w:val="0"/>
+          <w:szCs w:val="22"/>
+        </w:rPr>
+        <w:t>-</w:t>
+      </w:r>
+      <w:proofErr w:type="spellStart"/>
+      <w:r>
+        <w:rPr>
+          <w:rFonts w:ascii="Menlo" w:hAnsi="Menlo" w:cs="Menlo"/>
+          <w:color w:val="000000"/>
+          <w:kern w:val="0"/>
+          <w:szCs w:val="22"/>
+        </w:rPr>
+        <w:t>rw</w:t>
+      </w:r>
+      <w:proofErr w:type="spellEnd"/>
+      <w:r>
+        <w:rPr>
+          <w:rFonts w:ascii="Menlo" w:hAnsi="Menlo" w:cs="Menlo"/>
+          <w:color w:val="000000"/>
+          <w:kern w:val="0"/>
+          <w:szCs w:val="22"/>
+        </w:rPr>
+        <w:t>-r--r-- 1 2351610105 2351610105    0 Mar 16 14:18 a_copy.txt</w:t>
       </w:r>
     </w:p>
     <w:p>
@@ -3796,7 +3890,27 @@
           <w:kern w:val="0"/>
           <w:szCs w:val="22"/>
         </w:rPr>
-        <w:t>total 8</w:t>
+        <w:t>-</w:t>
+      </w:r>
+      <w:proofErr w:type="spellStart"/>
+      <w:r>
+        <w:rPr>
+          <w:rFonts w:ascii="Menlo" w:hAnsi="Menlo" w:cs="Menlo"/>
+          <w:color w:val="000000"/>
+          <w:kern w:val="0"/>
+          <w:szCs w:val="22"/>
+        </w:rPr>
+        <w:t>rw</w:t>
+      </w:r>
+      <w:proofErr w:type="spellEnd"/>
+      <w:r>
+        <w:rPr>
+          <w:rFonts w:ascii="Menlo" w:hAnsi="Menlo" w:cs="Menlo"/>
+          <w:color w:val="000000"/>
+          <w:kern w:val="0"/>
+          <w:szCs w:val="22"/>
+        </w:rPr>
+        <w:t>-r--r-- 1 2351610105 2351610105    0 Mar 16 14:18 a.txt</w:t>
       </w:r>
     </w:p>
     <w:p>
@@ -3826,6 +3940,15 @@
           <w:szCs w:val="22"/>
         </w:rPr>
       </w:pPr>
+      <w:r>
+        <w:rPr>
+          <w:rFonts w:ascii="Menlo" w:hAnsi="Menlo" w:cs="Menlo"/>
+          <w:color w:val="000000"/>
+          <w:kern w:val="0"/>
+          <w:szCs w:val="22"/>
+        </w:rPr>
+        <w:t>-</w:t>
+      </w:r>
       <w:proofErr w:type="spellStart"/>
       <w:r>
         <w:rPr>
@@ -3834,7 +3957,7 @@
           <w:kern w:val="0"/>
           <w:szCs w:val="22"/>
         </w:rPr>
-        <w:t>drwxr</w:t>
+        <w:t>rw</w:t>
       </w:r>
       <w:proofErr w:type="spellEnd"/>
       <w:r>
@@ -3844,50 +3967,8 @@
           <w:kern w:val="0"/>
           <w:szCs w:val="22"/>
         </w:rPr>
-        <w:t>-</w:t>
-      </w:r>
-      <w:proofErr w:type="spellStart"/>
-      <w:r>
-        <w:rPr>
-          <w:rFonts w:ascii="Menlo" w:hAnsi="Menlo" w:cs="Menlo"/>
-          <w:color w:val="000000"/>
-          <w:kern w:val="0"/>
-          <w:szCs w:val="22"/>
-        </w:rPr>
-        <w:t>xr</w:t>
-      </w:r>
-      <w:proofErr w:type="spellEnd"/>
-      <w:r>
-        <w:rPr>
-          <w:rFonts w:ascii="Menlo" w:hAnsi="Menlo" w:cs="Menlo"/>
-          <w:color w:val="000000"/>
-          <w:kern w:val="0"/>
-          <w:szCs w:val="22"/>
-        </w:rPr>
-        <w:t xml:space="preserve">-x 2 2351610105 2351610105 4096 Mar 16 </w:t>
-      </w:r>
-      <w:proofErr w:type="gramStart"/>
-      <w:r>
-        <w:rPr>
-          <w:rFonts w:ascii="Menlo" w:hAnsi="Menlo" w:cs="Menlo"/>
-          <w:color w:val="000000"/>
-          <w:kern w:val="0"/>
-          <w:szCs w:val="22"/>
-        </w:rPr>
-        <w:t xml:space="preserve">14:19 </w:t>
-      </w:r>
-      <w:r>
-        <w:rPr>
-          <w:rFonts w:ascii="Menlo" w:hAnsi="Menlo" w:cs="Menlo"/>
-          <w:b/>
-          <w:bCs/>
-          <w:color w:val="400BD9"/>
-          <w:kern w:val="0"/>
-          <w:szCs w:val="22"/>
-        </w:rPr>
-        <w:t>.</w:t>
-      </w:r>
-      <w:proofErr w:type="gramEnd"/>
+        <w:t>-r--r-- 1 2351610105 2351610105    0 Mar 16 14:18 b_renamed.txt</w:t>
+      </w:r>
     </w:p>
     <w:p>
       <w:pPr>
@@ -3916,68 +3997,70 @@
           <w:szCs w:val="22"/>
         </w:rPr>
       </w:pPr>
-      <w:proofErr w:type="spellStart"/>
-      <w:r>
-        <w:rPr>
-          <w:rFonts w:ascii="Menlo" w:hAnsi="Menlo" w:cs="Menlo"/>
-          <w:color w:val="000000"/>
-          <w:kern w:val="0"/>
-          <w:szCs w:val="22"/>
-        </w:rPr>
-        <w:t>drwxr</w:t>
-      </w:r>
-      <w:proofErr w:type="spellEnd"/>
-      <w:r>
-        <w:rPr>
-          <w:rFonts w:ascii="Menlo" w:hAnsi="Menlo" w:cs="Menlo"/>
-          <w:color w:val="000000"/>
-          <w:kern w:val="0"/>
-          <w:szCs w:val="22"/>
-        </w:rPr>
-        <w:t>-</w:t>
-      </w:r>
-      <w:proofErr w:type="spellStart"/>
-      <w:r>
-        <w:rPr>
-          <w:rFonts w:ascii="Menlo" w:hAnsi="Menlo" w:cs="Menlo"/>
-          <w:color w:val="000000"/>
-          <w:kern w:val="0"/>
-          <w:szCs w:val="22"/>
-        </w:rPr>
-        <w:t>xr</w:t>
-      </w:r>
-      <w:proofErr w:type="spellEnd"/>
-      <w:r>
-        <w:rPr>
-          <w:rFonts w:ascii="Menlo" w:hAnsi="Menlo" w:cs="Menlo"/>
-          <w:color w:val="000000"/>
-          <w:kern w:val="0"/>
-          <w:szCs w:val="22"/>
-        </w:rPr>
-        <w:t>-x 3 2351610105 2351610105 4096 Mar 16 14:17</w:t>
+      <w:r>
+        <w:rPr>
+          <w:rFonts w:ascii="Menlo" w:hAnsi="Menlo" w:cs="Menlo"/>
+          <w:b/>
+          <w:bCs/>
+          <w:color w:val="2FB41D"/>
+          <w:kern w:val="0"/>
+          <w:szCs w:val="22"/>
+        </w:rPr>
+        <w:t>2351610105@</w:t>
       </w:r>
       <w:proofErr w:type="gramStart"/>
       <w:r>
         <w:rPr>
           <w:rFonts w:ascii="Menlo" w:hAnsi="Menlo" w:cs="Menlo"/>
-          <w:color w:val="000000"/>
-          <w:kern w:val="0"/>
-          <w:szCs w:val="22"/>
-        </w:rPr>
-        <w:t xml:space="preserve"> </w:t>
-      </w:r>
-      <w:r>
-        <w:rPr>
-          <w:rFonts w:ascii="Menlo" w:hAnsi="Menlo" w:cs="Menlo"/>
-          <w:b/>
-          <w:bCs/>
-          <w:color w:val="400BD9"/>
-          <w:kern w:val="0"/>
-          <w:szCs w:val="22"/>
-        </w:rPr>
-        <w:t>..</w:t>
+          <w:b/>
+          <w:bCs/>
+          <w:color w:val="2FB41D"/>
+          <w:kern w:val="0"/>
+          <w:szCs w:val="22"/>
+        </w:rPr>
+        <w:t>raspberrypi</w:t>
+      </w:r>
+      <w:r>
+        <w:rPr>
+          <w:rFonts w:ascii="Menlo" w:hAnsi="Menlo" w:cs="Menlo"/>
+          <w:color w:val="000000"/>
+          <w:kern w:val="0"/>
+          <w:szCs w:val="22"/>
+        </w:rPr>
+        <w:t>:</w:t>
+      </w:r>
+      <w:r>
+        <w:rPr>
+          <w:rFonts w:ascii="Menlo" w:hAnsi="Menlo" w:cs="Menlo"/>
+          <w:b/>
+          <w:bCs/>
+          <w:color w:val="400BD9"/>
+          <w:kern w:val="0"/>
+          <w:szCs w:val="22"/>
+        </w:rPr>
+        <w:t>~</w:t>
       </w:r>
       <w:proofErr w:type="gramEnd"/>
+      <w:r>
+        <w:rPr>
+          <w:rFonts w:ascii="Menlo" w:hAnsi="Menlo" w:cs="Menlo"/>
+          <w:b/>
+          <w:bCs/>
+          <w:color w:val="400BD9"/>
+          <w:kern w:val="0"/>
+          <w:szCs w:val="22"/>
+        </w:rPr>
+        <w:t>/labs/lab0/practice $</w:t>
+      </w:r>
+      <w:r>
+        <w:rPr>
+          <w:rFonts w:ascii="Menlo" w:hAnsi="Menlo" w:cs="Menlo"/>
+          <w:color w:val="000000"/>
+          <w:kern w:val="0"/>
+          <w:szCs w:val="22"/>
+        </w:rPr>
+        <w:t xml:space="preserve"> cd ../</w:t>
+      </w:r>
     </w:p>
     <w:p>
       <w:pPr>
@@ -4009,31 +4092,66 @@
       <w:r>
         <w:rPr>
           <w:rFonts w:ascii="Menlo" w:hAnsi="Menlo" w:cs="Menlo"/>
-          <w:color w:val="000000"/>
-          <w:kern w:val="0"/>
-          <w:szCs w:val="22"/>
-        </w:rPr>
-        <w:t>-</w:t>
-      </w:r>
-      <w:proofErr w:type="spellStart"/>
-      <w:r>
-        <w:rPr>
-          <w:rFonts w:ascii="Menlo" w:hAnsi="Menlo" w:cs="Menlo"/>
-          <w:color w:val="000000"/>
-          <w:kern w:val="0"/>
-          <w:szCs w:val="22"/>
-        </w:rPr>
-        <w:t>rw</w:t>
-      </w:r>
-      <w:proofErr w:type="spellEnd"/>
-      <w:r>
-        <w:rPr>
-          <w:rFonts w:ascii="Menlo" w:hAnsi="Menlo" w:cs="Menlo"/>
-          <w:color w:val="000000"/>
-          <w:kern w:val="0"/>
-          <w:szCs w:val="22"/>
-        </w:rPr>
-        <w:t>-r--r-- 1 2351610105 2351610105    0 Mar 16 14:18 a_copy.txt</w:t>
+          <w:b/>
+          <w:bCs/>
+          <w:color w:val="2FB41D"/>
+          <w:kern w:val="0"/>
+          <w:szCs w:val="22"/>
+        </w:rPr>
+        <w:t>2351610105@</w:t>
+      </w:r>
+      <w:proofErr w:type="gramStart"/>
+      <w:r>
+        <w:rPr>
+          <w:rFonts w:ascii="Menlo" w:hAnsi="Menlo" w:cs="Menlo"/>
+          <w:b/>
+          <w:bCs/>
+          <w:color w:val="2FB41D"/>
+          <w:kern w:val="0"/>
+          <w:szCs w:val="22"/>
+        </w:rPr>
+        <w:t>raspberrypi</w:t>
+      </w:r>
+      <w:r>
+        <w:rPr>
+          <w:rFonts w:ascii="Menlo" w:hAnsi="Menlo" w:cs="Menlo"/>
+          <w:color w:val="000000"/>
+          <w:kern w:val="0"/>
+          <w:szCs w:val="22"/>
+        </w:rPr>
+        <w:t>:</w:t>
+      </w:r>
+      <w:r>
+        <w:rPr>
+          <w:rFonts w:ascii="Menlo" w:hAnsi="Menlo" w:cs="Menlo"/>
+          <w:b/>
+          <w:bCs/>
+          <w:color w:val="400BD9"/>
+          <w:kern w:val="0"/>
+          <w:szCs w:val="22"/>
+        </w:rPr>
+        <w:t>~</w:t>
+      </w:r>
+      <w:proofErr w:type="gramEnd"/>
+      <w:r>
+        <w:rPr>
+          <w:rFonts w:ascii="Menlo" w:hAnsi="Menlo" w:cs="Menlo"/>
+          <w:b/>
+          <w:bCs/>
+          <w:color w:val="400BD9"/>
+          <w:kern w:val="0"/>
+          <w:szCs w:val="22"/>
+        </w:rPr>
+        <w:t>/labs/lab0 $</w:t>
+      </w:r>
+      <w:r>
+        <w:rPr>
+          <w:rFonts w:ascii="Menlo" w:hAnsi="Menlo" w:cs="Menlo"/>
+          <w:color w:val="000000"/>
+          <w:kern w:val="0"/>
+          <w:szCs w:val="22"/>
+        </w:rPr>
+        <w:t xml:space="preserve"> echo 'echo "Linux Lab0" &gt;log.txt'&gt;lab0_3.sh</w:t>
       </w:r>
     </w:p>
     <w:p>
@@ -4058,39 +4176,76 @@
         <w:spacing w:after="0" w:line="240" w:lineRule="auto"/>
         <w:rPr>
           <w:rFonts w:ascii="Menlo" w:hAnsi="Menlo" w:cs="Menlo"/>
-          <w:color w:val="000000"/>
-          <w:kern w:val="0"/>
-          <w:szCs w:val="22"/>
-        </w:rPr>
-      </w:pPr>
-      <w:r>
-        <w:rPr>
-          <w:rFonts w:ascii="Menlo" w:hAnsi="Menlo" w:cs="Menlo"/>
-          <w:color w:val="000000"/>
-          <w:kern w:val="0"/>
-          <w:szCs w:val="22"/>
-        </w:rPr>
-        <w:t>-</w:t>
-      </w:r>
-      <w:proofErr w:type="spellStart"/>
-      <w:r>
-        <w:rPr>
-          <w:rFonts w:ascii="Menlo" w:hAnsi="Menlo" w:cs="Menlo"/>
-          <w:color w:val="000000"/>
-          <w:kern w:val="0"/>
-          <w:szCs w:val="22"/>
-        </w:rPr>
-        <w:t>rw</w:t>
-      </w:r>
-      <w:proofErr w:type="spellEnd"/>
-      <w:r>
-        <w:rPr>
-          <w:rFonts w:ascii="Menlo" w:hAnsi="Menlo" w:cs="Menlo"/>
-          <w:color w:val="000000"/>
-          <w:kern w:val="0"/>
-          <w:szCs w:val="22"/>
-        </w:rPr>
-        <w:t>-r--r-- 1 2351610105 2351610105    0 Mar 16 14:18 a.txt</w:t>
+          <w:b/>
+          <w:bCs/>
+          <w:color w:val="2FB41D"/>
+          <w:kern w:val="0"/>
+          <w:szCs w:val="22"/>
+        </w:rPr>
+      </w:pPr>
+      <w:r>
+        <w:rPr>
+          <w:rFonts w:ascii="Menlo" w:hAnsi="Menlo" w:cs="Menlo"/>
+          <w:b/>
+          <w:bCs/>
+          <w:color w:val="2FB41D"/>
+          <w:kern w:val="0"/>
+          <w:szCs w:val="22"/>
+        </w:rPr>
+        <w:t>2351610105@</w:t>
+      </w:r>
+      <w:proofErr w:type="gramStart"/>
+      <w:r>
+        <w:rPr>
+          <w:rFonts w:ascii="Menlo" w:hAnsi="Menlo" w:cs="Menlo"/>
+          <w:b/>
+          <w:bCs/>
+          <w:color w:val="2FB41D"/>
+          <w:kern w:val="0"/>
+          <w:szCs w:val="22"/>
+        </w:rPr>
+        <w:t>raspberrypi</w:t>
+      </w:r>
+      <w:r>
+        <w:rPr>
+          <w:rFonts w:ascii="Menlo" w:hAnsi="Menlo" w:cs="Menlo"/>
+          <w:color w:val="000000"/>
+          <w:kern w:val="0"/>
+          <w:szCs w:val="22"/>
+        </w:rPr>
+        <w:t>:</w:t>
+      </w:r>
+      <w:r>
+        <w:rPr>
+          <w:rFonts w:ascii="Menlo" w:hAnsi="Menlo" w:cs="Menlo"/>
+          <w:b/>
+          <w:bCs/>
+          <w:color w:val="400BD9"/>
+          <w:kern w:val="0"/>
+          <w:szCs w:val="22"/>
+        </w:rPr>
+        <w:t>~</w:t>
+      </w:r>
+      <w:proofErr w:type="gramEnd"/>
+      <w:r>
+        <w:rPr>
+          <w:rFonts w:ascii="Menlo" w:hAnsi="Menlo" w:cs="Menlo"/>
+          <w:b/>
+          <w:bCs/>
+          <w:color w:val="400BD9"/>
+          <w:kern w:val="0"/>
+          <w:szCs w:val="22"/>
+        </w:rPr>
+        <w:t>/labs/lab0 $</w:t>
+      </w:r>
+      <w:r>
+        <w:rPr>
+          <w:rFonts w:ascii="Menlo" w:hAnsi="Menlo" w:cs="Menlo"/>
+          <w:color w:val="000000"/>
+          <w:kern w:val="0"/>
+          <w:szCs w:val="22"/>
+        </w:rPr>
+        <w:t xml:space="preserve"> echo 'echo $(date) &gt;&gt;log.txt'&gt;&gt;lab0_3.sh</w:t>
       </w:r>
     </w:p>
     <w:p>
@@ -4123,31 +4278,66 @@
       <w:r>
         <w:rPr>
           <w:rFonts w:ascii="Menlo" w:hAnsi="Menlo" w:cs="Menlo"/>
-          <w:color w:val="000000"/>
-          <w:kern w:val="0"/>
-          <w:szCs w:val="22"/>
-        </w:rPr>
-        <w:t>-</w:t>
-      </w:r>
-      <w:proofErr w:type="spellStart"/>
-      <w:r>
-        <w:rPr>
-          <w:rFonts w:ascii="Menlo" w:hAnsi="Menlo" w:cs="Menlo"/>
-          <w:color w:val="000000"/>
-          <w:kern w:val="0"/>
-          <w:szCs w:val="22"/>
-        </w:rPr>
-        <w:t>rw</w:t>
-      </w:r>
-      <w:proofErr w:type="spellEnd"/>
-      <w:r>
-        <w:rPr>
-          <w:rFonts w:ascii="Menlo" w:hAnsi="Menlo" w:cs="Menlo"/>
-          <w:color w:val="000000"/>
-          <w:kern w:val="0"/>
-          <w:szCs w:val="22"/>
-        </w:rPr>
-        <w:t>-r--r-- 1 2351610105 2351610105    0 Mar 16 14:18 b_renamed.txt</w:t>
+          <w:b/>
+          <w:bCs/>
+          <w:color w:val="2FB41D"/>
+          <w:kern w:val="0"/>
+          <w:szCs w:val="22"/>
+        </w:rPr>
+        <w:t>2351610105@</w:t>
+      </w:r>
+      <w:proofErr w:type="gramStart"/>
+      <w:r>
+        <w:rPr>
+          <w:rFonts w:ascii="Menlo" w:hAnsi="Menlo" w:cs="Menlo"/>
+          <w:b/>
+          <w:bCs/>
+          <w:color w:val="2FB41D"/>
+          <w:kern w:val="0"/>
+          <w:szCs w:val="22"/>
+        </w:rPr>
+        <w:t>raspberrypi</w:t>
+      </w:r>
+      <w:r>
+        <w:rPr>
+          <w:rFonts w:ascii="Menlo" w:hAnsi="Menlo" w:cs="Menlo"/>
+          <w:color w:val="000000"/>
+          <w:kern w:val="0"/>
+          <w:szCs w:val="22"/>
+        </w:rPr>
+        <w:t>:</w:t>
+      </w:r>
+      <w:r>
+        <w:rPr>
+          <w:rFonts w:ascii="Menlo" w:hAnsi="Menlo" w:cs="Menlo"/>
+          <w:b/>
+          <w:bCs/>
+          <w:color w:val="400BD9"/>
+          <w:kern w:val="0"/>
+          <w:szCs w:val="22"/>
+        </w:rPr>
+        <w:t>~</w:t>
+      </w:r>
+      <w:proofErr w:type="gramEnd"/>
+      <w:r>
+        <w:rPr>
+          <w:rFonts w:ascii="Menlo" w:hAnsi="Menlo" w:cs="Menlo"/>
+          <w:b/>
+          <w:bCs/>
+          <w:color w:val="400BD9"/>
+          <w:kern w:val="0"/>
+          <w:szCs w:val="22"/>
+        </w:rPr>
+        <w:t>/labs/lab0 $</w:t>
+      </w:r>
+      <w:r>
+        <w:rPr>
+          <w:rFonts w:ascii="Menlo" w:hAnsi="Menlo" w:cs="Menlo"/>
+          <w:color w:val="000000"/>
+          <w:kern w:val="0"/>
+          <w:szCs w:val="22"/>
+        </w:rPr>
+        <w:t xml:space="preserve"> bash ./lab0_3.sh</w:t>
       </w:r>
     </w:p>
     <w:p>
@@ -4230,16 +4420,16 @@
           <w:kern w:val="0"/>
           <w:szCs w:val="22"/>
         </w:rPr>
-        <w:t>/labs/lab0/practice $</w:t>
-      </w:r>
-      <w:r>
-        <w:rPr>
-          <w:rFonts w:ascii="Menlo" w:hAnsi="Menlo" w:cs="Menlo"/>
-          <w:color w:val="000000"/>
-          <w:kern w:val="0"/>
-          <w:szCs w:val="22"/>
-        </w:rPr>
-        <w:t xml:space="preserve"> cd ../</w:t>
+        <w:t>/labs/lab0 $</w:t>
+      </w:r>
+      <w:r>
+        <w:rPr>
+          <w:rFonts w:ascii="Menlo" w:hAnsi="Menlo" w:cs="Menlo"/>
+          <w:color w:val="000000"/>
+          <w:kern w:val="0"/>
+          <w:szCs w:val="22"/>
+        </w:rPr>
+        <w:t xml:space="preserve"> ls</w:t>
       </w:r>
     </w:p>
     <w:p>
@@ -4269,69 +4459,36 @@
           <w:szCs w:val="22"/>
         </w:rPr>
       </w:pPr>
-      <w:r>
-        <w:rPr>
-          <w:rFonts w:ascii="Menlo" w:hAnsi="Menlo" w:cs="Menlo"/>
-          <w:b/>
-          <w:bCs/>
-          <w:color w:val="2FB41D"/>
-          <w:kern w:val="0"/>
-          <w:szCs w:val="22"/>
-        </w:rPr>
-        <w:t>2351610105@</w:t>
-      </w:r>
       <w:proofErr w:type="gramStart"/>
       <w:r>
         <w:rPr>
           <w:rFonts w:ascii="Menlo" w:hAnsi="Menlo" w:cs="Menlo"/>
-          <w:b/>
-          <w:bCs/>
-          <w:color w:val="2FB41D"/>
-          <w:kern w:val="0"/>
-          <w:szCs w:val="22"/>
-        </w:rPr>
-        <w:t>raspberrypi</w:t>
-      </w:r>
-      <w:r>
-        <w:rPr>
-          <w:rFonts w:ascii="Menlo" w:hAnsi="Menlo" w:cs="Menlo"/>
-          <w:color w:val="000000"/>
-          <w:kern w:val="0"/>
-          <w:szCs w:val="22"/>
-        </w:rPr>
-        <w:t>:</w:t>
-      </w:r>
-      <w:r>
-        <w:rPr>
-          <w:rFonts w:ascii="Menlo" w:hAnsi="Menlo" w:cs="Menlo"/>
-          <w:b/>
-          <w:bCs/>
-          <w:color w:val="400BD9"/>
-          <w:kern w:val="0"/>
-          <w:szCs w:val="22"/>
-        </w:rPr>
-        <w:t>~</w:t>
+          <w:color w:val="000000"/>
+          <w:kern w:val="0"/>
+          <w:szCs w:val="22"/>
+        </w:rPr>
+        <w:t>lab0_1.sh  lab0_2.sh</w:t>
       </w:r>
       <w:proofErr w:type="gramEnd"/>
       <w:r>
         <w:rPr>
           <w:rFonts w:ascii="Menlo" w:hAnsi="Menlo" w:cs="Menlo"/>
-          <w:b/>
-          <w:bCs/>
-          <w:color w:val="400BD9"/>
-          <w:kern w:val="0"/>
-          <w:szCs w:val="22"/>
-        </w:rPr>
-        <w:t>/labs/lab0 $</w:t>
-      </w:r>
-      <w:r>
-        <w:rPr>
-          <w:rFonts w:ascii="Menlo" w:hAnsi="Menlo" w:cs="Menlo"/>
-          <w:color w:val="000000"/>
-          <w:kern w:val="0"/>
-          <w:szCs w:val="22"/>
-        </w:rPr>
-        <w:t xml:space="preserve"> echo 'echo \"Linux Lab0\" &gt;log.txt'&gt;lab0_3.sh</w:t>
+          <w:color w:val="000000"/>
+          <w:kern w:val="0"/>
+          <w:szCs w:val="22"/>
+        </w:rPr>
+        <w:t xml:space="preserve">  lab0_3.sh  log.txt  </w:t>
+      </w:r>
+      <w:r>
+        <w:rPr>
+          <w:rFonts w:ascii="Menlo" w:hAnsi="Menlo" w:cs="Menlo"/>
+          <w:b/>
+          <w:bCs/>
+          <w:color w:val="400BD9"/>
+          <w:kern w:val="0"/>
+          <w:szCs w:val="22"/>
+        </w:rPr>
+        <w:t>practice</w:t>
       </w:r>
     </w:p>
     <w:p>
@@ -4423,7 +4580,7 @@
           <w:kern w:val="0"/>
           <w:szCs w:val="22"/>
         </w:rPr>
-        <w:t xml:space="preserve"> echo 'echo \"$(date)\" &gt;&gt;log.txt'&gt;&gt;lab0_3.sh</w:t>
+        <w:t xml:space="preserve"> cat log.txt</w:t>
       </w:r>
     </w:p>
     <w:p>
@@ -4456,66 +4613,11 @@
       <w:r>
         <w:rPr>
           <w:rFonts w:ascii="Menlo" w:hAnsi="Menlo" w:cs="Menlo"/>
-          <w:b/>
-          <w:bCs/>
-          <w:color w:val="2FB41D"/>
-          <w:kern w:val="0"/>
-          <w:szCs w:val="22"/>
-        </w:rPr>
-        <w:t>2351610105@</w:t>
-      </w:r>
-      <w:proofErr w:type="gramStart"/>
-      <w:r>
-        <w:rPr>
-          <w:rFonts w:ascii="Menlo" w:hAnsi="Menlo" w:cs="Menlo"/>
-          <w:b/>
-          <w:bCs/>
-          <w:color w:val="2FB41D"/>
-          <w:kern w:val="0"/>
-          <w:szCs w:val="22"/>
-        </w:rPr>
-        <w:t>raspberrypi</w:t>
-      </w:r>
-      <w:r>
-        <w:rPr>
-          <w:rFonts w:ascii="Menlo" w:hAnsi="Menlo" w:cs="Menlo"/>
-          <w:color w:val="000000"/>
-          <w:kern w:val="0"/>
-          <w:szCs w:val="22"/>
-        </w:rPr>
-        <w:t>:</w:t>
-      </w:r>
-      <w:r>
-        <w:rPr>
-          <w:rFonts w:ascii="Menlo" w:hAnsi="Menlo" w:cs="Menlo"/>
-          <w:b/>
-          <w:bCs/>
-          <w:color w:val="400BD9"/>
-          <w:kern w:val="0"/>
-          <w:szCs w:val="22"/>
-        </w:rPr>
-        <w:t>~</w:t>
-      </w:r>
-      <w:proofErr w:type="gramEnd"/>
-      <w:r>
-        <w:rPr>
-          <w:rFonts w:ascii="Menlo" w:hAnsi="Menlo" w:cs="Menlo"/>
-          <w:b/>
-          <w:bCs/>
-          <w:color w:val="400BD9"/>
-          <w:kern w:val="0"/>
-          <w:szCs w:val="22"/>
-        </w:rPr>
-        <w:t>/labs/lab0 $</w:t>
-      </w:r>
-      <w:r>
-        <w:rPr>
-          <w:rFonts w:ascii="Menlo" w:hAnsi="Menlo" w:cs="Menlo"/>
-          <w:color w:val="000000"/>
-          <w:kern w:val="0"/>
-          <w:szCs w:val="22"/>
-        </w:rPr>
-        <w:t xml:space="preserve"> bash ./lab0_3.sh</w:t>
+          <w:color w:val="000000"/>
+          <w:kern w:val="0"/>
+          <w:szCs w:val="22"/>
+        </w:rPr>
+        <w:t>Linux Lab0</w:t>
       </w:r>
     </w:p>
     <w:p>
@@ -4548,67 +4650,11 @@
       <w:r>
         <w:rPr>
           <w:rFonts w:ascii="Menlo" w:hAnsi="Menlo" w:cs="Menlo"/>
-          <w:b/>
-          <w:bCs/>
-          <w:color w:val="2FB41D"/>
-          <w:kern w:val="0"/>
-          <w:szCs w:val="22"/>
-        </w:rPr>
-        <w:lastRenderedPageBreak/>
-        <w:t>2351610105@</w:t>
-      </w:r>
-      <w:proofErr w:type="gramStart"/>
-      <w:r>
-        <w:rPr>
-          <w:rFonts w:ascii="Menlo" w:hAnsi="Menlo" w:cs="Menlo"/>
-          <w:b/>
-          <w:bCs/>
-          <w:color w:val="2FB41D"/>
-          <w:kern w:val="0"/>
-          <w:szCs w:val="22"/>
-        </w:rPr>
-        <w:t>raspberrypi</w:t>
-      </w:r>
-      <w:r>
-        <w:rPr>
-          <w:rFonts w:ascii="Menlo" w:hAnsi="Menlo" w:cs="Menlo"/>
-          <w:color w:val="000000"/>
-          <w:kern w:val="0"/>
-          <w:szCs w:val="22"/>
-        </w:rPr>
-        <w:t>:</w:t>
-      </w:r>
-      <w:r>
-        <w:rPr>
-          <w:rFonts w:ascii="Menlo" w:hAnsi="Menlo" w:cs="Menlo"/>
-          <w:b/>
-          <w:bCs/>
-          <w:color w:val="400BD9"/>
-          <w:kern w:val="0"/>
-          <w:szCs w:val="22"/>
-        </w:rPr>
-        <w:t>~</w:t>
-      </w:r>
-      <w:proofErr w:type="gramEnd"/>
-      <w:r>
-        <w:rPr>
-          <w:rFonts w:ascii="Menlo" w:hAnsi="Menlo" w:cs="Menlo"/>
-          <w:b/>
-          <w:bCs/>
-          <w:color w:val="400BD9"/>
-          <w:kern w:val="0"/>
-          <w:szCs w:val="22"/>
-        </w:rPr>
-        <w:t>/labs/lab0 $</w:t>
-      </w:r>
-      <w:r>
-        <w:rPr>
-          <w:rFonts w:ascii="Menlo" w:hAnsi="Menlo" w:cs="Menlo"/>
-          <w:color w:val="000000"/>
-          <w:kern w:val="0"/>
-          <w:szCs w:val="22"/>
-        </w:rPr>
-        <w:t xml:space="preserve"> ls</w:t>
+          <w:color w:val="000000"/>
+          <w:kern w:val="0"/>
+          <w:szCs w:val="22"/>
+        </w:rPr>
+        <w:t>Mon 16 Mar 14:22:36 CST 2026</w:t>
       </w:r>
     </w:p>
     <w:p>
@@ -4638,36 +4684,69 @@
           <w:szCs w:val="22"/>
         </w:rPr>
       </w:pPr>
+      <w:r>
+        <w:rPr>
+          <w:rFonts w:ascii="Menlo" w:hAnsi="Menlo" w:cs="Menlo"/>
+          <w:b/>
+          <w:bCs/>
+          <w:color w:val="2FB41D"/>
+          <w:kern w:val="0"/>
+          <w:szCs w:val="22"/>
+        </w:rPr>
+        <w:t>2351610105@</w:t>
+      </w:r>
       <w:proofErr w:type="gramStart"/>
       <w:r>
         <w:rPr>
           <w:rFonts w:ascii="Menlo" w:hAnsi="Menlo" w:cs="Menlo"/>
-          <w:color w:val="000000"/>
-          <w:kern w:val="0"/>
-          <w:szCs w:val="22"/>
-        </w:rPr>
-        <w:t>lab0_1.sh  lab0_2.sh</w:t>
+          <w:b/>
+          <w:bCs/>
+          <w:color w:val="2FB41D"/>
+          <w:kern w:val="0"/>
+          <w:szCs w:val="22"/>
+        </w:rPr>
+        <w:t>raspberrypi</w:t>
+      </w:r>
+      <w:r>
+        <w:rPr>
+          <w:rFonts w:ascii="Menlo" w:hAnsi="Menlo" w:cs="Menlo"/>
+          <w:color w:val="000000"/>
+          <w:kern w:val="0"/>
+          <w:szCs w:val="22"/>
+        </w:rPr>
+        <w:t>:</w:t>
+      </w:r>
+      <w:r>
+        <w:rPr>
+          <w:rFonts w:ascii="Menlo" w:hAnsi="Menlo" w:cs="Menlo"/>
+          <w:b/>
+          <w:bCs/>
+          <w:color w:val="400BD9"/>
+          <w:kern w:val="0"/>
+          <w:szCs w:val="22"/>
+        </w:rPr>
+        <w:t>~</w:t>
       </w:r>
       <w:proofErr w:type="gramEnd"/>
       <w:r>
         <w:rPr>
           <w:rFonts w:ascii="Menlo" w:hAnsi="Menlo" w:cs="Menlo"/>
-          <w:color w:val="000000"/>
-          <w:kern w:val="0"/>
-          <w:szCs w:val="22"/>
-        </w:rPr>
-        <w:t xml:space="preserve">  lab0_3.sh  log.txt  </w:t>
-      </w:r>
-      <w:r>
-        <w:rPr>
-          <w:rFonts w:ascii="Menlo" w:hAnsi="Menlo" w:cs="Menlo"/>
-          <w:b/>
-          <w:bCs/>
-          <w:color w:val="400BD9"/>
-          <w:kern w:val="0"/>
-          <w:szCs w:val="22"/>
-        </w:rPr>
-        <w:t>practice</w:t>
+          <w:b/>
+          <w:bCs/>
+          <w:color w:val="400BD9"/>
+          <w:kern w:val="0"/>
+          <w:szCs w:val="22"/>
+        </w:rPr>
+        <w:t>/labs/lab0 $</w:t>
+      </w:r>
+      <w:r>
+        <w:rPr>
+          <w:rFonts w:ascii="Menlo" w:hAnsi="Menlo" w:cs="Menlo"/>
+          <w:color w:val="000000"/>
+          <w:kern w:val="0"/>
+          <w:szCs w:val="22"/>
+        </w:rPr>
+        <w:t xml:space="preserve"> echo 'head -n 2 log.txt' &gt;lab0_4.sh</w:t>
       </w:r>
     </w:p>
     <w:p>
@@ -4759,7 +4838,7 @@
           <w:kern w:val="0"/>
           <w:szCs w:val="22"/>
         </w:rPr>
-        <w:t xml:space="preserve"> cat log.txt</w:t>
+        <w:t xml:space="preserve"> echo 'tail -n 1 log.txt' &gt;&gt;lab0_4.sh</w:t>
       </w:r>
     </w:p>
     <w:p>
@@ -4792,11 +4871,67 @@
       <w:r>
         <w:rPr>
           <w:rFonts w:ascii="Menlo" w:hAnsi="Menlo" w:cs="Menlo"/>
-          <w:color w:val="000000"/>
-          <w:kern w:val="0"/>
-          <w:szCs w:val="22"/>
-        </w:rPr>
-        <w:t>"Linux Lab0"</w:t>
+          <w:b/>
+          <w:bCs/>
+          <w:color w:val="2FB41D"/>
+          <w:kern w:val="0"/>
+          <w:szCs w:val="22"/>
+        </w:rPr>
+        <w:lastRenderedPageBreak/>
+        <w:t>2351610105@</w:t>
+      </w:r>
+      <w:proofErr w:type="gramStart"/>
+      <w:r>
+        <w:rPr>
+          <w:rFonts w:ascii="Menlo" w:hAnsi="Menlo" w:cs="Menlo"/>
+          <w:b/>
+          <w:bCs/>
+          <w:color w:val="2FB41D"/>
+          <w:kern w:val="0"/>
+          <w:szCs w:val="22"/>
+        </w:rPr>
+        <w:t>raspberrypi</w:t>
+      </w:r>
+      <w:r>
+        <w:rPr>
+          <w:rFonts w:ascii="Menlo" w:hAnsi="Menlo" w:cs="Menlo"/>
+          <w:color w:val="000000"/>
+          <w:kern w:val="0"/>
+          <w:szCs w:val="22"/>
+        </w:rPr>
+        <w:t>:</w:t>
+      </w:r>
+      <w:r>
+        <w:rPr>
+          <w:rFonts w:ascii="Menlo" w:hAnsi="Menlo" w:cs="Menlo"/>
+          <w:b/>
+          <w:bCs/>
+          <w:color w:val="400BD9"/>
+          <w:kern w:val="0"/>
+          <w:szCs w:val="22"/>
+        </w:rPr>
+        <w:t>~</w:t>
+      </w:r>
+      <w:proofErr w:type="gramEnd"/>
+      <w:r>
+        <w:rPr>
+          <w:rFonts w:ascii="Menlo" w:hAnsi="Menlo" w:cs="Menlo"/>
+          <w:b/>
+          <w:bCs/>
+          <w:color w:val="400BD9"/>
+          <w:kern w:val="0"/>
+          <w:szCs w:val="22"/>
+        </w:rPr>
+        <w:t>/labs/lab0 $</w:t>
+      </w:r>
+      <w:r>
+        <w:rPr>
+          <w:rFonts w:ascii="Menlo" w:hAnsi="Menlo" w:cs="Menlo"/>
+          <w:color w:val="000000"/>
+          <w:kern w:val="0"/>
+          <w:szCs w:val="22"/>
+        </w:rPr>
+        <w:t xml:space="preserve"> bash ./lab0_4.sh</w:t>
       </w:r>
     </w:p>
     <w:p>
@@ -4833,7 +4968,7 @@
           <w:kern w:val="0"/>
           <w:szCs w:val="22"/>
         </w:rPr>
-        <w:t>"Mon 16 Mar 14:22:36 CST 2026"</w:t>
+        <w:t>"Linux Lab0"</w:t>
       </w:r>
     </w:p>
     <w:p>
@@ -4866,66 +5001,11 @@
       <w:r>
         <w:rPr>
           <w:rFonts w:ascii="Menlo" w:hAnsi="Menlo" w:cs="Menlo"/>
-          <w:b/>
-          <w:bCs/>
-          <w:color w:val="2FB41D"/>
-          <w:kern w:val="0"/>
-          <w:szCs w:val="22"/>
-        </w:rPr>
-        <w:t>2351610105@</w:t>
-      </w:r>
-      <w:proofErr w:type="gramStart"/>
-      <w:r>
-        <w:rPr>
-          <w:rFonts w:ascii="Menlo" w:hAnsi="Menlo" w:cs="Menlo"/>
-          <w:b/>
-          <w:bCs/>
-          <w:color w:val="2FB41D"/>
-          <w:kern w:val="0"/>
-          <w:szCs w:val="22"/>
-        </w:rPr>
-        <w:t>raspberrypi</w:t>
-      </w:r>
-      <w:r>
-        <w:rPr>
-          <w:rFonts w:ascii="Menlo" w:hAnsi="Menlo" w:cs="Menlo"/>
-          <w:color w:val="000000"/>
-          <w:kern w:val="0"/>
-          <w:szCs w:val="22"/>
-        </w:rPr>
-        <w:t>:</w:t>
-      </w:r>
-      <w:r>
-        <w:rPr>
-          <w:rFonts w:ascii="Menlo" w:hAnsi="Menlo" w:cs="Menlo"/>
-          <w:b/>
-          <w:bCs/>
-          <w:color w:val="400BD9"/>
-          <w:kern w:val="0"/>
-          <w:szCs w:val="22"/>
-        </w:rPr>
-        <w:t>~</w:t>
-      </w:r>
-      <w:proofErr w:type="gramEnd"/>
-      <w:r>
-        <w:rPr>
-          <w:rFonts w:ascii="Menlo" w:hAnsi="Menlo" w:cs="Menlo"/>
-          <w:b/>
-          <w:bCs/>
-          <w:color w:val="400BD9"/>
-          <w:kern w:val="0"/>
-          <w:szCs w:val="22"/>
-        </w:rPr>
-        <w:t>/labs/lab0 $</w:t>
-      </w:r>
-      <w:r>
-        <w:rPr>
-          <w:rFonts w:ascii="Menlo" w:hAnsi="Menlo" w:cs="Menlo"/>
-          <w:color w:val="000000"/>
-          <w:kern w:val="0"/>
-          <w:szCs w:val="22"/>
-        </w:rPr>
-        <w:t xml:space="preserve"> echo 'head -n 2 log.txt' &gt;lab0_4.sh</w:t>
+          <w:color w:val="000000"/>
+          <w:kern w:val="0"/>
+          <w:szCs w:val="22"/>
+        </w:rPr>
+        <w:t>"Mon 16 Mar 14:22:36 CST 2026"</w:t>
       </w:r>
     </w:p>
     <w:p>
@@ -4958,66 +5038,11 @@
       <w:r>
         <w:rPr>
           <w:rFonts w:ascii="Menlo" w:hAnsi="Menlo" w:cs="Menlo"/>
-          <w:b/>
-          <w:bCs/>
-          <w:color w:val="2FB41D"/>
-          <w:kern w:val="0"/>
-          <w:szCs w:val="22"/>
-        </w:rPr>
-        <w:t>2351610105@</w:t>
-      </w:r>
-      <w:proofErr w:type="gramStart"/>
-      <w:r>
-        <w:rPr>
-          <w:rFonts w:ascii="Menlo" w:hAnsi="Menlo" w:cs="Menlo"/>
-          <w:b/>
-          <w:bCs/>
-          <w:color w:val="2FB41D"/>
-          <w:kern w:val="0"/>
-          <w:szCs w:val="22"/>
-        </w:rPr>
-        <w:t>raspberrypi</w:t>
-      </w:r>
-      <w:r>
-        <w:rPr>
-          <w:rFonts w:ascii="Menlo" w:hAnsi="Menlo" w:cs="Menlo"/>
-          <w:color w:val="000000"/>
-          <w:kern w:val="0"/>
-          <w:szCs w:val="22"/>
-        </w:rPr>
-        <w:t>:</w:t>
-      </w:r>
-      <w:r>
-        <w:rPr>
-          <w:rFonts w:ascii="Menlo" w:hAnsi="Menlo" w:cs="Menlo"/>
-          <w:b/>
-          <w:bCs/>
-          <w:color w:val="400BD9"/>
-          <w:kern w:val="0"/>
-          <w:szCs w:val="22"/>
-        </w:rPr>
-        <w:t>~</w:t>
-      </w:r>
-      <w:proofErr w:type="gramEnd"/>
-      <w:r>
-        <w:rPr>
-          <w:rFonts w:ascii="Menlo" w:hAnsi="Menlo" w:cs="Menlo"/>
-          <w:b/>
-          <w:bCs/>
-          <w:color w:val="400BD9"/>
-          <w:kern w:val="0"/>
-          <w:szCs w:val="22"/>
-        </w:rPr>
-        <w:t>/labs/lab0 $</w:t>
-      </w:r>
-      <w:r>
-        <w:rPr>
-          <w:rFonts w:ascii="Menlo" w:hAnsi="Menlo" w:cs="Menlo"/>
-          <w:color w:val="000000"/>
-          <w:kern w:val="0"/>
-          <w:szCs w:val="22"/>
-        </w:rPr>
-        <w:t xml:space="preserve"> echo 'tail -n 1 log.txt' &gt;&gt;lab0_4.sh</w:t>
+          <w:color w:val="000000"/>
+          <w:kern w:val="0"/>
+          <w:szCs w:val="22"/>
+        </w:rPr>
+        <w:t>"Mon 16 Mar 14:22:36 CST 2026"</w:t>
       </w:r>
     </w:p>
     <w:p>
@@ -5109,7 +5134,7 @@
           <w:kern w:val="0"/>
           <w:szCs w:val="22"/>
         </w:rPr>
-        <w:t xml:space="preserve"> bash ./lab0_4.sh</w:t>
+        <w:t xml:space="preserve"> echo 'echo Run OK' &gt; run_me.sh</w:t>
       </w:r>
     </w:p>
     <w:p>
@@ -5142,11 +5167,66 @@
       <w:r>
         <w:rPr>
           <w:rFonts w:ascii="Menlo" w:hAnsi="Menlo" w:cs="Menlo"/>
-          <w:color w:val="000000"/>
-          <w:kern w:val="0"/>
-          <w:szCs w:val="22"/>
-        </w:rPr>
-        <w:t>"Linux Lab0"</w:t>
+          <w:b/>
+          <w:bCs/>
+          <w:color w:val="2FB41D"/>
+          <w:kern w:val="0"/>
+          <w:szCs w:val="22"/>
+        </w:rPr>
+        <w:t>2351610105@</w:t>
+      </w:r>
+      <w:proofErr w:type="gramStart"/>
+      <w:r>
+        <w:rPr>
+          <w:rFonts w:ascii="Menlo" w:hAnsi="Menlo" w:cs="Menlo"/>
+          <w:b/>
+          <w:bCs/>
+          <w:color w:val="2FB41D"/>
+          <w:kern w:val="0"/>
+          <w:szCs w:val="22"/>
+        </w:rPr>
+        <w:t>raspberrypi</w:t>
+      </w:r>
+      <w:r>
+        <w:rPr>
+          <w:rFonts w:ascii="Menlo" w:hAnsi="Menlo" w:cs="Menlo"/>
+          <w:color w:val="000000"/>
+          <w:kern w:val="0"/>
+          <w:szCs w:val="22"/>
+        </w:rPr>
+        <w:t>:</w:t>
+      </w:r>
+      <w:r>
+        <w:rPr>
+          <w:rFonts w:ascii="Menlo" w:hAnsi="Menlo" w:cs="Menlo"/>
+          <w:b/>
+          <w:bCs/>
+          <w:color w:val="400BD9"/>
+          <w:kern w:val="0"/>
+          <w:szCs w:val="22"/>
+        </w:rPr>
+        <w:t>~</w:t>
+      </w:r>
+      <w:proofErr w:type="gramEnd"/>
+      <w:r>
+        <w:rPr>
+          <w:rFonts w:ascii="Menlo" w:hAnsi="Menlo" w:cs="Menlo"/>
+          <w:b/>
+          <w:bCs/>
+          <w:color w:val="400BD9"/>
+          <w:kern w:val="0"/>
+          <w:szCs w:val="22"/>
+        </w:rPr>
+        <w:t>/labs/lab0 $</w:t>
+      </w:r>
+      <w:r>
+        <w:rPr>
+          <w:rFonts w:ascii="Menlo" w:hAnsi="Menlo" w:cs="Menlo"/>
+          <w:color w:val="000000"/>
+          <w:kern w:val="0"/>
+          <w:szCs w:val="22"/>
+        </w:rPr>
+        <w:t xml:space="preserve"> bash ./run_me.sh</w:t>
       </w:r>
     </w:p>
     <w:p>
@@ -5183,7 +5263,7 @@
           <w:kern w:val="0"/>
           <w:szCs w:val="22"/>
         </w:rPr>
-        <w:t>"Mon 16 Mar 14:22:36 CST 2026"</w:t>
+        <w:t>Run OK</w:t>
       </w:r>
     </w:p>
     <w:p>
@@ -5216,11 +5296,86 @@
       <w:r>
         <w:rPr>
           <w:rFonts w:ascii="Menlo" w:hAnsi="Menlo" w:cs="Menlo"/>
-          <w:color w:val="000000"/>
-          <w:kern w:val="0"/>
-          <w:szCs w:val="22"/>
-        </w:rPr>
-        <w:t>"Mon 16 Mar 14:22:36 CST 2026"</w:t>
+          <w:b/>
+          <w:bCs/>
+          <w:color w:val="2FB41D"/>
+          <w:kern w:val="0"/>
+          <w:szCs w:val="22"/>
+        </w:rPr>
+        <w:t>2351610105@</w:t>
+      </w:r>
+      <w:proofErr w:type="gramStart"/>
+      <w:r>
+        <w:rPr>
+          <w:rFonts w:ascii="Menlo" w:hAnsi="Menlo" w:cs="Menlo"/>
+          <w:b/>
+          <w:bCs/>
+          <w:color w:val="2FB41D"/>
+          <w:kern w:val="0"/>
+          <w:szCs w:val="22"/>
+        </w:rPr>
+        <w:t>raspberrypi</w:t>
+      </w:r>
+      <w:r>
+        <w:rPr>
+          <w:rFonts w:ascii="Menlo" w:hAnsi="Menlo" w:cs="Menlo"/>
+          <w:color w:val="000000"/>
+          <w:kern w:val="0"/>
+          <w:szCs w:val="22"/>
+        </w:rPr>
+        <w:t>:</w:t>
+      </w:r>
+      <w:r>
+        <w:rPr>
+          <w:rFonts w:ascii="Menlo" w:hAnsi="Menlo" w:cs="Menlo"/>
+          <w:b/>
+          <w:bCs/>
+          <w:color w:val="400BD9"/>
+          <w:kern w:val="0"/>
+          <w:szCs w:val="22"/>
+        </w:rPr>
+        <w:t>~</w:t>
+      </w:r>
+      <w:proofErr w:type="gramEnd"/>
+      <w:r>
+        <w:rPr>
+          <w:rFonts w:ascii="Menlo" w:hAnsi="Menlo" w:cs="Menlo"/>
+          <w:b/>
+          <w:bCs/>
+          <w:color w:val="400BD9"/>
+          <w:kern w:val="0"/>
+          <w:szCs w:val="22"/>
+        </w:rPr>
+        <w:t>/labs/lab0 $</w:t>
+      </w:r>
+      <w:r>
+        <w:rPr>
+          <w:rFonts w:ascii="Menlo" w:hAnsi="Menlo" w:cs="Menlo"/>
+          <w:color w:val="000000"/>
+          <w:kern w:val="0"/>
+          <w:szCs w:val="22"/>
+        </w:rPr>
+        <w:t xml:space="preserve"> </w:t>
+      </w:r>
+      <w:proofErr w:type="spellStart"/>
+      <w:r>
+        <w:rPr>
+          <w:rFonts w:ascii="Menlo" w:hAnsi="Menlo" w:cs="Menlo"/>
+          <w:color w:val="000000"/>
+          <w:kern w:val="0"/>
+          <w:szCs w:val="22"/>
+        </w:rPr>
+        <w:t>chmod</w:t>
+      </w:r>
+      <w:proofErr w:type="spellEnd"/>
+      <w:r>
+        <w:rPr>
+          <w:rFonts w:ascii="Menlo" w:hAnsi="Menlo" w:cs="Menlo"/>
+          <w:color w:val="000000"/>
+          <w:kern w:val="0"/>
+          <w:szCs w:val="22"/>
+        </w:rPr>
+        <w:t xml:space="preserve"> +x run_me.sh</w:t>
       </w:r>
     </w:p>
     <w:p>
@@ -5312,7 +5467,26 @@
           <w:kern w:val="0"/>
           <w:szCs w:val="22"/>
         </w:rPr>
-        <w:t xml:space="preserve"> echo 'echo Run OK' &gt; run_me.sh</w:t>
+        <w:t xml:space="preserve"> bash ./run_me.sh</w:t>
+      </w:r>
+    </w:p>
+    <w:p>
+      <w:pPr>
+        <w:rPr>
+          <w:rFonts w:ascii="Menlo" w:hAnsi="Menlo" w:cs="Menlo"/>
+          <w:color w:val="000000"/>
+          <w:kern w:val="0"/>
+          <w:szCs w:val="22"/>
+        </w:rPr>
+      </w:pPr>
+      <w:r>
+        <w:rPr>
+          <w:rFonts w:ascii="Menlo" w:hAnsi="Menlo" w:cs="Menlo"/>
+          <w:color w:val="000000"/>
+          <w:kern w:val="0"/>
+          <w:szCs w:val="22"/>
+        </w:rPr>
+        <w:t>Run OK</w:t>
       </w:r>
     </w:p>
     <w:p>
@@ -5404,7 +5578,7 @@
           <w:kern w:val="0"/>
           <w:szCs w:val="22"/>
         </w:rPr>
-        <w:t xml:space="preserve"> bash ./run_me.sh</w:t>
+        <w:t xml:space="preserve"> echo 'echo "echo Run OK"&gt;run_me.sh' &gt;lab0_5.sh</w:t>
       </w:r>
     </w:p>
     <w:p>
@@ -5437,11 +5611,86 @@
       <w:r>
         <w:rPr>
           <w:rFonts w:ascii="Menlo" w:hAnsi="Menlo" w:cs="Menlo"/>
-          <w:color w:val="000000"/>
-          <w:kern w:val="0"/>
-          <w:szCs w:val="22"/>
-        </w:rPr>
-        <w:t>Run OK</w:t>
+          <w:b/>
+          <w:bCs/>
+          <w:color w:val="2FB41D"/>
+          <w:kern w:val="0"/>
+          <w:szCs w:val="22"/>
+        </w:rPr>
+        <w:t>2351610105@</w:t>
+      </w:r>
+      <w:proofErr w:type="gramStart"/>
+      <w:r>
+        <w:rPr>
+          <w:rFonts w:ascii="Menlo" w:hAnsi="Menlo" w:cs="Menlo"/>
+          <w:b/>
+          <w:bCs/>
+          <w:color w:val="2FB41D"/>
+          <w:kern w:val="0"/>
+          <w:szCs w:val="22"/>
+        </w:rPr>
+        <w:t>raspberrypi</w:t>
+      </w:r>
+      <w:r>
+        <w:rPr>
+          <w:rFonts w:ascii="Menlo" w:hAnsi="Menlo" w:cs="Menlo"/>
+          <w:color w:val="000000"/>
+          <w:kern w:val="0"/>
+          <w:szCs w:val="22"/>
+        </w:rPr>
+        <w:t>:</w:t>
+      </w:r>
+      <w:r>
+        <w:rPr>
+          <w:rFonts w:ascii="Menlo" w:hAnsi="Menlo" w:cs="Menlo"/>
+          <w:b/>
+          <w:bCs/>
+          <w:color w:val="400BD9"/>
+          <w:kern w:val="0"/>
+          <w:szCs w:val="22"/>
+        </w:rPr>
+        <w:t>~</w:t>
+      </w:r>
+      <w:proofErr w:type="gramEnd"/>
+      <w:r>
+        <w:rPr>
+          <w:rFonts w:ascii="Menlo" w:hAnsi="Menlo" w:cs="Menlo"/>
+          <w:b/>
+          <w:bCs/>
+          <w:color w:val="400BD9"/>
+          <w:kern w:val="0"/>
+          <w:szCs w:val="22"/>
+        </w:rPr>
+        <w:t>/labs/lab0 $</w:t>
+      </w:r>
+      <w:r>
+        <w:rPr>
+          <w:rFonts w:ascii="Menlo" w:hAnsi="Menlo" w:cs="Menlo"/>
+          <w:color w:val="000000"/>
+          <w:kern w:val="0"/>
+          <w:szCs w:val="22"/>
+        </w:rPr>
+        <w:t xml:space="preserve"> </w:t>
+      </w:r>
+      <w:proofErr w:type="spellStart"/>
+      <w:r>
+        <w:rPr>
+          <w:rFonts w:ascii="Menlo" w:hAnsi="Menlo" w:cs="Menlo"/>
+          <w:color w:val="000000"/>
+          <w:kern w:val="0"/>
+          <w:szCs w:val="22"/>
+        </w:rPr>
+        <w:t>chmod</w:t>
+      </w:r>
+      <w:proofErr w:type="spellEnd"/>
+      <w:r>
+        <w:rPr>
+          <w:rFonts w:ascii="Menlo" w:hAnsi="Menlo" w:cs="Menlo"/>
+          <w:color w:val="000000"/>
+          <w:kern w:val="0"/>
+          <w:szCs w:val="22"/>
+        </w:rPr>
+        <w:t xml:space="preserve"> +x lab0_5.sh</w:t>
       </w:r>
     </w:p>
     <w:p>
@@ -5533,27 +5782,7 @@
           <w:kern w:val="0"/>
           <w:szCs w:val="22"/>
         </w:rPr>
-        <w:t xml:space="preserve"> </w:t>
-      </w:r>
-      <w:proofErr w:type="spellStart"/>
-      <w:r>
-        <w:rPr>
-          <w:rFonts w:ascii="Menlo" w:hAnsi="Menlo" w:cs="Menlo"/>
-          <w:color w:val="000000"/>
-          <w:kern w:val="0"/>
-          <w:szCs w:val="22"/>
-        </w:rPr>
-        <w:t>chmod</w:t>
-      </w:r>
-      <w:proofErr w:type="spellEnd"/>
-      <w:r>
-        <w:rPr>
-          <w:rFonts w:ascii="Menlo" w:hAnsi="Menlo" w:cs="Menlo"/>
-          <w:color w:val="000000"/>
-          <w:kern w:val="0"/>
-          <w:szCs w:val="22"/>
-        </w:rPr>
-        <w:t xml:space="preserve"> +x run_me.sh</w:t>
+        <w:t xml:space="preserve"> bash ./lab0_5.sh</w:t>
       </w:r>
     </w:p>
     <w:p>
@@ -5645,44 +5874,310 @@
           <w:kern w:val="0"/>
           <w:szCs w:val="22"/>
         </w:rPr>
-        <w:t xml:space="preserve"> bash ./run_me.sh</w:t>
-      </w:r>
-    </w:p>
-    <w:p>
-      <w:pPr>
-        <w:rPr>
-          <w:rFonts w:ascii="Menlo" w:hAnsi="Menlo" w:cs="Menlo"/>
-          <w:color w:val="000000"/>
-          <w:kern w:val="0"/>
-          <w:szCs w:val="22"/>
-        </w:rPr>
-      </w:pPr>
-      <w:r>
-        <w:rPr>
-          <w:rFonts w:ascii="Menlo" w:hAnsi="Menlo" w:cs="Menlo"/>
-          <w:color w:val="000000"/>
-          <w:kern w:val="0"/>
-          <w:szCs w:val="22"/>
-        </w:rPr>
-        <w:t>Run OK</w:t>
-      </w:r>
-    </w:p>
-    <w:p>
-      <w:pPr>
-        <w:rPr>
-          <w:rFonts w:ascii="Menlo" w:hAnsi="Menlo" w:cs="Menlo"/>
-          <w:color w:val="000000"/>
-          <w:kern w:val="0"/>
-          <w:szCs w:val="22"/>
-        </w:rPr>
-      </w:pPr>
-    </w:p>
-    <w:p>
-      <w:pPr>
-        <w:rPr>
-          <w:rFonts w:hint="eastAsia"/>
-        </w:rPr>
-      </w:pPr>
+        <w:t xml:space="preserve"> ls</w:t>
+      </w:r>
+    </w:p>
+    <w:p>
+      <w:pPr>
+        <w:tabs>
+          <w:tab w:val="left" w:pos="560"/>
+          <w:tab w:val="left" w:pos="1120"/>
+          <w:tab w:val="left" w:pos="1680"/>
+          <w:tab w:val="left" w:pos="2240"/>
+          <w:tab w:val="left" w:pos="2800"/>
+          <w:tab w:val="left" w:pos="3360"/>
+          <w:tab w:val="left" w:pos="3920"/>
+          <w:tab w:val="left" w:pos="4480"/>
+          <w:tab w:val="left" w:pos="5040"/>
+          <w:tab w:val="left" w:pos="5600"/>
+          <w:tab w:val="left" w:pos="6160"/>
+          <w:tab w:val="left" w:pos="6720"/>
+        </w:tabs>
+        <w:autoSpaceDE w:val="0"/>
+        <w:autoSpaceDN w:val="0"/>
+        <w:adjustRightInd w:val="0"/>
+        <w:spacing w:after="0" w:line="240" w:lineRule="auto"/>
+        <w:rPr>
+          <w:rFonts w:ascii="Menlo" w:hAnsi="Menlo" w:cs="Menlo"/>
+          <w:color w:val="000000"/>
+          <w:kern w:val="0"/>
+          <w:szCs w:val="22"/>
+        </w:rPr>
+      </w:pPr>
+      <w:proofErr w:type="gramStart"/>
+      <w:r>
+        <w:rPr>
+          <w:rFonts w:ascii="Menlo" w:hAnsi="Menlo" w:cs="Menlo"/>
+          <w:color w:val="000000"/>
+          <w:kern w:val="0"/>
+          <w:szCs w:val="22"/>
+        </w:rPr>
+        <w:t>lab0_1.sh  lab0_3.sh</w:t>
+      </w:r>
+      <w:proofErr w:type="gramEnd"/>
+      <w:r>
+        <w:rPr>
+          <w:rFonts w:ascii="Menlo" w:hAnsi="Menlo" w:cs="Menlo"/>
+          <w:color w:val="000000"/>
+          <w:kern w:val="0"/>
+          <w:szCs w:val="22"/>
+        </w:rPr>
+        <w:t xml:space="preserve">  </w:t>
+      </w:r>
+      <w:r>
+        <w:rPr>
+          <w:rFonts w:ascii="Menlo" w:hAnsi="Menlo" w:cs="Menlo"/>
+          <w:b/>
+          <w:bCs/>
+          <w:color w:val="2FB41D"/>
+          <w:kern w:val="0"/>
+          <w:szCs w:val="22"/>
+        </w:rPr>
+        <w:t>lab0_5.sh</w:t>
+      </w:r>
+      <w:r>
+        <w:rPr>
+          <w:rFonts w:ascii="Menlo" w:hAnsi="Menlo" w:cs="Menlo"/>
+          <w:color w:val="000000"/>
+          <w:kern w:val="0"/>
+          <w:szCs w:val="22"/>
+        </w:rPr>
+        <w:t xml:space="preserve">        log.txt   </w:t>
+      </w:r>
+      <w:r>
+        <w:rPr>
+          <w:rFonts w:ascii="Menlo" w:hAnsi="Menlo" w:cs="Menlo"/>
+          <w:b/>
+          <w:bCs/>
+          <w:color w:val="2FB41D"/>
+          <w:kern w:val="0"/>
+          <w:szCs w:val="22"/>
+        </w:rPr>
+        <w:t>run_me.sh</w:t>
+      </w:r>
+    </w:p>
+    <w:p>
+      <w:pPr>
+        <w:tabs>
+          <w:tab w:val="left" w:pos="560"/>
+          <w:tab w:val="left" w:pos="1120"/>
+          <w:tab w:val="left" w:pos="1680"/>
+          <w:tab w:val="left" w:pos="2240"/>
+          <w:tab w:val="left" w:pos="2800"/>
+          <w:tab w:val="left" w:pos="3360"/>
+          <w:tab w:val="left" w:pos="3920"/>
+          <w:tab w:val="left" w:pos="4480"/>
+          <w:tab w:val="left" w:pos="5040"/>
+          <w:tab w:val="left" w:pos="5600"/>
+          <w:tab w:val="left" w:pos="6160"/>
+          <w:tab w:val="left" w:pos="6720"/>
+        </w:tabs>
+        <w:autoSpaceDE w:val="0"/>
+        <w:autoSpaceDN w:val="0"/>
+        <w:adjustRightInd w:val="0"/>
+        <w:spacing w:after="0" w:line="240" w:lineRule="auto"/>
+        <w:rPr>
+          <w:rFonts w:ascii="Menlo" w:hAnsi="Menlo" w:cs="Menlo"/>
+          <w:color w:val="000000"/>
+          <w:kern w:val="0"/>
+          <w:szCs w:val="22"/>
+        </w:rPr>
+      </w:pPr>
+      <w:proofErr w:type="gramStart"/>
+      <w:r>
+        <w:rPr>
+          <w:rFonts w:ascii="Menlo" w:hAnsi="Menlo" w:cs="Menlo"/>
+          <w:color w:val="000000"/>
+          <w:kern w:val="0"/>
+          <w:szCs w:val="22"/>
+        </w:rPr>
+        <w:t>lab0_2.sh  lab0_4.sh</w:t>
+      </w:r>
+      <w:proofErr w:type="gramEnd"/>
+      <w:r>
+        <w:rPr>
+          <w:rFonts w:ascii="Menlo" w:hAnsi="Menlo" w:cs="Menlo"/>
+          <w:color w:val="000000"/>
+          <w:kern w:val="0"/>
+          <w:szCs w:val="22"/>
+        </w:rPr>
+        <w:t xml:space="preserve">  lab0_report.txt  </w:t>
+      </w:r>
+      <w:r>
+        <w:rPr>
+          <w:rFonts w:ascii="Menlo" w:hAnsi="Menlo" w:cs="Menlo"/>
+          <w:b/>
+          <w:bCs/>
+          <w:color w:val="400BD9"/>
+          <w:kern w:val="0"/>
+          <w:szCs w:val="22"/>
+        </w:rPr>
+        <w:t>practice</w:t>
+      </w:r>
+    </w:p>
+    <w:p>
+      <w:pPr>
+        <w:rPr>
+          <w:rFonts w:ascii="Menlo" w:hAnsi="Menlo" w:cs="Menlo"/>
+          <w:color w:val="000000"/>
+          <w:kern w:val="0"/>
+          <w:szCs w:val="22"/>
+        </w:rPr>
+      </w:pPr>
+      <w:r>
+        <w:rPr>
+          <w:rFonts w:ascii="Menlo" w:hAnsi="Menlo" w:cs="Menlo"/>
+          <w:b/>
+          <w:bCs/>
+          <w:color w:val="2FB41D"/>
+          <w:kern w:val="0"/>
+          <w:szCs w:val="22"/>
+        </w:rPr>
+        <w:t>2351610105@</w:t>
+      </w:r>
+      <w:proofErr w:type="gramStart"/>
+      <w:r>
+        <w:rPr>
+          <w:rFonts w:ascii="Menlo" w:hAnsi="Menlo" w:cs="Menlo"/>
+          <w:b/>
+          <w:bCs/>
+          <w:color w:val="2FB41D"/>
+          <w:kern w:val="0"/>
+          <w:szCs w:val="22"/>
+        </w:rPr>
+        <w:t>raspberrypi</w:t>
+      </w:r>
+      <w:r>
+        <w:rPr>
+          <w:rFonts w:ascii="Menlo" w:hAnsi="Menlo" w:cs="Menlo"/>
+          <w:color w:val="000000"/>
+          <w:kern w:val="0"/>
+          <w:szCs w:val="22"/>
+        </w:rPr>
+        <w:t>:</w:t>
+      </w:r>
+      <w:r>
+        <w:rPr>
+          <w:rFonts w:ascii="Menlo" w:hAnsi="Menlo" w:cs="Menlo"/>
+          <w:b/>
+          <w:bCs/>
+          <w:color w:val="400BD9"/>
+          <w:kern w:val="0"/>
+          <w:szCs w:val="22"/>
+        </w:rPr>
+        <w:t>~</w:t>
+      </w:r>
+      <w:proofErr w:type="gramEnd"/>
+      <w:r>
+        <w:rPr>
+          <w:rFonts w:ascii="Menlo" w:hAnsi="Menlo" w:cs="Menlo"/>
+          <w:b/>
+          <w:bCs/>
+          <w:color w:val="400BD9"/>
+          <w:kern w:val="0"/>
+          <w:szCs w:val="22"/>
+        </w:rPr>
+        <w:t>/labs/lab0 $</w:t>
+      </w:r>
+      <w:r>
+        <w:rPr>
+          <w:rFonts w:ascii="Menlo" w:hAnsi="Menlo" w:cs="Menlo"/>
+          <w:color w:val="000000"/>
+          <w:kern w:val="0"/>
+          <w:szCs w:val="22"/>
+        </w:rPr>
+        <w:t xml:space="preserve"> </w:t>
+      </w:r>
+      <w:r>
+        <w:rPr>
+          <w:rFonts w:ascii="Menlo" w:hAnsi="Menlo" w:cs="Menlo"/>
+          <w:color w:val="000000"/>
+          <w:kern w:val="0"/>
+          <w:szCs w:val="22"/>
+        </w:rPr>
+        <w:t>cat</w:t>
+      </w:r>
+      <w:r>
+        <w:rPr>
+          <w:rFonts w:ascii="Menlo" w:hAnsi="Menlo" w:cs="Menlo"/>
+          <w:color w:val="000000"/>
+          <w:kern w:val="0"/>
+          <w:szCs w:val="22"/>
+        </w:rPr>
+        <w:t xml:space="preserve"> run_me.sh</w:t>
+      </w:r>
+    </w:p>
+    <w:p>
+      <w:pPr>
+        <w:rPr>
+          <w:rFonts w:ascii="Menlo" w:hAnsi="Menlo" w:cs="Menlo"/>
+          <w:color w:val="000000"/>
+          <w:kern w:val="0"/>
+          <w:szCs w:val="22"/>
+        </w:rPr>
+      </w:pPr>
+      <w:r>
+        <w:rPr>
+          <w:rFonts w:ascii="Menlo" w:hAnsi="Menlo" w:cs="Menlo"/>
+          <w:noProof/>
+          <w:color w:val="000000"/>
+          <w:kern w:val="0"/>
+          <w:szCs w:val="22"/>
+        </w:rPr>
+        <w:drawing>
+          <wp:inline distT="0" distB="0" distL="0" distR="0">
+            <wp:extent cx="5274310" cy="312420"/>
+            <wp:effectExtent l="0" t="0" r="0" b="5080"/>
+            <wp:docPr id="2130735606" name="图片 4"/>
+            <wp:cNvGraphicFramePr>
+              <a:graphicFrameLocks xmlns:a="http://schemas.openxmlformats.org/drawingml/2006/main" noChangeAspect="1"/>
+            </wp:cNvGraphicFramePr>
+            <a:graphic xmlns:a="http://schemas.openxmlformats.org/drawingml/2006/main">
+              <a:graphicData uri="http://schemas.openxmlformats.org/drawingml/2006/picture">
+                <pic:pic xmlns:pic="http://schemas.openxmlformats.org/drawingml/2006/picture">
+                  <pic:nvPicPr>
+                    <pic:cNvPr id="2130735606" name="图片 2130735606"/>
+                    <pic:cNvPicPr/>
+                  </pic:nvPicPr>
+                  <pic:blipFill>
+                    <a:blip r:embed="rId13">
+                      <a:extLst>
+                        <a:ext uri="{28A0092B-C50C-407E-A947-70E740481C1C}">
+                          <a14:useLocalDpi xmlns:a14="http://schemas.microsoft.com/office/drawing/2010/main" val="0"/>
+                        </a:ext>
+                      </a:extLst>
+                    </a:blip>
+                    <a:stretch>
+                      <a:fillRect/>
+                    </a:stretch>
+                  </pic:blipFill>
+                  <pic:spPr>
+                    <a:xfrm>
+                      <a:off x="0" y="0"/>
+                      <a:ext cx="5274310" cy="312420"/>
+                    </a:xfrm>
+                    <a:prstGeom prst="rect">
+                      <a:avLst/>
+                    </a:prstGeom>
+                  </pic:spPr>
+                </pic:pic>
+              </a:graphicData>
+            </a:graphic>
+          </wp:inline>
+        </w:drawing>
+      </w:r>
+    </w:p>
+    <w:p>
+      <w:pPr>
+        <w:rPr>
+          <w:rFonts w:ascii="Menlo" w:hAnsi="Menlo" w:cs="Menlo" w:hint="eastAsia"/>
+          <w:color w:val="000000"/>
+          <w:kern w:val="0"/>
+          <w:szCs w:val="22"/>
+        </w:rPr>
+      </w:pPr>
+    </w:p>
+    <w:p>
       <w:r>
         <w:t xml:space="preserve">And </w:t>
       </w:r>
@@ -5696,11 +6191,6 @@
       </w:r>
     </w:p>
     <w:p>
-      <w:pPr>
-        <w:rPr>
-          <w:rFonts w:hint="eastAsia"/>
-        </w:rPr>
-      </w:pPr>
       <w:r>
         <w:rPr>
           <w:rFonts w:hint="eastAsia"/>
@@ -5723,7 +6213,7 @@
                     <pic:cNvPicPr/>
                   </pic:nvPicPr>
                   <pic:blipFill>
-                    <a:blip r:embed="rId11">
+                    <a:blip r:embed="rId14">
                       <a:extLst>
                         <a:ext uri="{28A0092B-C50C-407E-A947-70E740481C1C}">
                           <a14:useLocalDpi xmlns:a14="http://schemas.microsoft.com/office/drawing/2010/main" val="0"/>

</xml_diff>